<commit_message>
Keep scoped lore to Trails: the direct-award tool and its guide text
"Record a finding without a clock" shows only in a setting with scoped
lore cards (Trails of Blood & Dust), and the GM's Guide sentence about it
is written only there. Aurora's and Fracture Lines' GM guides and Word
files are back to what they were; their creators keep the plain clock
and card editor (the shared code is inert for them).

Co-Authored-By: Claude Opus 5.5 <noreply@anthropic.com>
Claude-Session: https://claude.ai/code/session_015SADCFzhKijkC2foUmXrpC
</commit_message>
<xml_diff>
--- a/legend-dynamics/aurora/Aurora_GM_Guide.docx
+++ b/legend-dynamics/aurora/Aurora_GM_Guide.docx
@@ -5526,23 +5526,7 @@
         <w:t xml:space="preserve"> </w:t>
       </w:r>
       <w:r>
-        <w:t xml:space="preserve">gives the primary investigator the dossier and everyone you tick as present a shared copy.</w:t>
-      </w:r>
-      <w:r>
-        <w:t xml:space="preserve"> </w:t>
-      </w:r>
-      <w:r>
-        <w:rPr>
-          <w:bCs/>
-          <w:b/>
-        </w:rPr>
-        <w:t xml:space="preserve">Record a finding without a clock</w:t>
-      </w:r>
-      <w:r>
-        <w:t xml:space="preserve"> </w:t>
-      </w:r>
-      <w:r>
-        <w:t xml:space="preserve">gives a dossier for something established directly (seen or tested, a reliable account, a creature’s word with evidence behind it) to whoever you tick. Save all to file afterwards, so the players’ character files carry it. The Discord bot’s</w:t>
+        <w:t xml:space="preserve">gives the primary investigator the dossier and everyone you tick as present a shared copy. Save all to file afterwards, so the players’ character files carry it. The Discord bot’s</w:t>
       </w:r>
       <w:r>
         <w:t xml:space="preserve"> </w:t>

</xml_diff>

<commit_message>
Aurora: stat blocks and GM view threats for every named character
- Every Notable Operant in the GM's Guide (21) gets a stat block under
  their entry, plus Autuarch, who gets an entry of his own. Each block
  gives Class, attacks with their Classes, Dodge, boxes, Defense,
  powers, skills, and a trait for playing them at the table. The guide's
  own ratings set each Class: the Named villains table and the EMD's
  examples.
- All 22 join the pack's threats as named threats, with a true
  Defense Class. A second defense is added for Celerity, the Atomic Man
  and Autuarch. The threats bring 15 Class III to VI attacks (power
  blasts, super-strong blows, power weapons, a manifested firearm,
  living nightmares), so the Encounter panel applies Defense as the
  rules say.
- Changelog entry.

Co-Authored-By: Claude Opus 5.5 <noreply@anthropic.com>
Claude-Session: https://claude.ai/code/session_015SADCFzhKijkC2foUmXrpC
</commit_message>
<xml_diff>
--- a/legend-dynamics/aurora/Aurora_GM_Guide.docx
+++ b/legend-dynamics/aurora/Aurora_GM_Guide.docx
@@ -2388,7 +2388,7 @@
         <w:pStyle w:val="FirstParagraph"/>
       </w:pPr>
       <w:r>
-        <w:t xml:space="preserve">Ages are as of 2025.</w:t>
+        <w:t xml:space="preserve">Ages are as of 2025. Each comes with a stat block, and each is in the GM view’s Encounter panel as a threat, under their name and Class. They use the rules for powers: an attack’s Class against their Defense decides what gets through.</w:t>
       </w:r>
     </w:p>
     <w:p>
@@ -2415,16 +2415,122 @@
       </w:pPr>
       <w:r>
         <w:rPr>
-          <w:bCs/>
-          <w:b/>
-        </w:rPr>
-        <w:t xml:space="preserve">Celerity (Ava Torres), 33.</w:t>
-      </w:r>
-      <w:r>
-        <w:t xml:space="preserve"> </w:t>
-      </w:r>
-      <w:r>
-        <w:t xml:space="preserve">The super-fast Latina heroine of New York, who protects the innocent and defends the helpless. She fought the Umkas in 2012, and Steel Hawk nearly killed her; the Golden Centurion got her help, but she spent a year in a coma. Since waking she has dedicated herself to helping people across the country. She befriended the Green Man and persuaded him to open the Haven, and has stood between federal authorities and the refugees at every confrontation. There is a warrant for her arrest; ExLAW’s Operants aren’t pursuing it, yet.</w:t>
+          <w:iCs/>
+          <w:i/>
+        </w:rPr>
+        <w:t xml:space="preserve">Class IV.</w:t>
+      </w:r>
+      <w:r>
+        <w:t xml:space="preserve"> </w:t>
+      </w:r>
+      <w:r>
+        <w:rPr>
+          <w:bCs/>
+          <w:b/>
+        </w:rPr>
+        <w:t xml:space="preserve">Attacks</w:t>
+      </w:r>
+      <w:r>
+        <w:t xml:space="preserve"> </w:t>
+      </w:r>
+      <w:r>
+        <w:t xml:space="preserve">Brawling 15 (Strength IV); Powers 15 (electrical bolt, Blast IV).</w:t>
+      </w:r>
+      <w:r>
+        <w:t xml:space="preserve"> </w:t>
+      </w:r>
+      <w:r>
+        <w:rPr>
+          <w:bCs/>
+          <w:b/>
+        </w:rPr>
+        <w:t xml:space="preserve">Dodge</w:t>
+      </w:r>
+      <w:r>
+        <w:t xml:space="preserve"> </w:t>
+      </w:r>
+      <w:r>
+        <w:t xml:space="preserve">11.</w:t>
+      </w:r>
+      <w:r>
+        <w:t xml:space="preserve"> </w:t>
+      </w:r>
+      <w:r>
+        <w:rPr>
+          <w:bCs/>
+          <w:b/>
+        </w:rPr>
+        <w:t xml:space="preserve">Boxes</w:t>
+      </w:r>
+      <w:r>
+        <w:t xml:space="preserve"> </w:t>
+      </w:r>
+      <w:r>
+        <w:t xml:space="preserve">6.</w:t>
+      </w:r>
+      <w:r>
+        <w:t xml:space="preserve"> </w:t>
+      </w:r>
+      <w:r>
+        <w:rPr>
+          <w:bCs/>
+          <w:b/>
+        </w:rPr>
+        <w:t xml:space="preserve">Defense</w:t>
+      </w:r>
+      <w:r>
+        <w:t xml:space="preserve"> </w:t>
+      </w:r>
+      <w:r>
+        <w:t xml:space="preserve">IV (Toughness).</w:t>
+      </w:r>
+      <w:r>
+        <w:t xml:space="preserve"> </w:t>
+      </w:r>
+      <w:r>
+        <w:rPr>
+          <w:bCs/>
+          <w:b/>
+        </w:rPr>
+        <w:t xml:space="preserve">Powers</w:t>
+      </w:r>
+      <w:r>
+        <w:t xml:space="preserve"> </w:t>
+      </w:r>
+      <w:r>
+        <w:t xml:space="preserve">Strength IV, Toughness IV, Flight IV, Blast IV, all in the Marvel form; Transformation (the form, one action to call up).</w:t>
+      </w:r>
+      <w:r>
+        <w:t xml:space="preserve"> </w:t>
+      </w:r>
+      <w:r>
+        <w:rPr>
+          <w:bCs/>
+          <w:b/>
+        </w:rPr>
+        <w:t xml:space="preserve">Skills</w:t>
+      </w:r>
+      <w:r>
+        <w:t xml:space="preserve"> </w:t>
+      </w:r>
+      <w:r>
+        <w:t xml:space="preserve">Medicine 15, Leadership 14, Persuasion 13, Read People 13.</w:t>
+      </w:r>
+      <w:r>
+        <w:t xml:space="preserve"> </w:t>
+      </w:r>
+      <w:r>
+        <w:rPr>
+          <w:bCs/>
+          <w:b/>
+        </w:rPr>
+        <w:t xml:space="preserve">Two lives.</w:t>
+      </w:r>
+      <w:r>
+        <w:t xml:space="preserve"> </w:t>
+      </w:r>
+      <w:r>
+        <w:t xml:space="preserve">As Hector Gonzalez he has no powers and Medicine 15. In the Marvel form his impatience and anger rise: a Will roll to walk away from a fight he’s winning.</w:t>
       </w:r>
     </w:p>
     <w:p>
@@ -2436,13 +2542,13 @@
           <w:bCs/>
           <w:b/>
         </w:rPr>
-        <w:t xml:space="preserve">The Green Man (Micky Holt).</w:t>
-      </w:r>
-      <w:r>
-        <w:t xml:space="preserve"> </w:t>
-      </w:r>
-      <w:r>
-        <w:t xml:space="preserve">A struggling folk singer, exposed to something… different on a peyote-driven walkabout in the Southwest. It drove him insane, though he still loves to play. His power over plants raised an impenetrable forest across southern Indiana in a matter of days: from Bloomington to the Ohio River you travel on foot, on horseback or by boat. He offers sanctuary to anyone who swears to protect the Earth and spread its message, and serves only vegetarian meals. Any attempt to burn or harm the forest ends in horror-movie destruction by rampaging plants. The Haven, his refuge for America’s homeless, is the one place he allows fire, for warmth and cooking.</w:t>
+        <w:t xml:space="preserve">Celerity (Ava Torres), 33.</w:t>
+      </w:r>
+      <w:r>
+        <w:t xml:space="preserve"> </w:t>
+      </w:r>
+      <w:r>
+        <w:t xml:space="preserve">The super-fast Latina heroine of New York, who protects the innocent and defends the helpless. She fought the Umkas in 2012, and Steel Hawk nearly killed her; the Golden Centurion got her help, but she spent a year in a coma. Since waking she has dedicated herself to helping people across the country. She befriended the Green Man and persuaded him to open the Haven, and has stood between federal authorities and the refugees at every confrontation. There is a warrant for her arrest; ExLAW’s Operants aren’t pursuing it, yet.</w:t>
       </w:r>
     </w:p>
     <w:p>
@@ -2451,29 +2557,122 @@
       </w:pPr>
       <w:r>
         <w:rPr>
-          <w:bCs/>
-          <w:b/>
-        </w:rPr>
-        <w:t xml:space="preserve">Michael Lance, 47.</w:t>
-      </w:r>
-      <w:r>
-        <w:t xml:space="preserve"> </w:t>
-      </w:r>
-      <w:r>
-        <w:t xml:space="preserve">A 1940s private investigator pulled into a timeless Limbo during a case in 1946, and released by the breach in 2012. He wields a mystic amulet inherited from his grandfather, bonded to him by the spirit of</w:t>
-      </w:r>
-      <w:r>
-        <w:t xml:space="preserve"> </w:t>
-      </w:r>
-      <w:r>
-        <w:rPr>
-          <w:bCs/>
-          <w:b/>
-        </w:rPr>
-        <w:t xml:space="preserve">Em Antu</w:t>
-      </w:r>
-      <w:r>
-        <w:t xml:space="preserve">, the Egyptian priest and sorcerer who made it. It lights a room, fires a laser that cuts steel, and casts realistic illusions. He has used it against all manner of strange beings in New York’s shadows, and against the duplicates of Shadow Earth.</w:t>
+          <w:iCs/>
+          <w:i/>
+        </w:rPr>
+        <w:t xml:space="preserve">Class IV.</w:t>
+      </w:r>
+      <w:r>
+        <w:t xml:space="preserve"> </w:t>
+      </w:r>
+      <w:r>
+        <w:rPr>
+          <w:bCs/>
+          <w:b/>
+        </w:rPr>
+        <w:t xml:space="preserve">Attacks</w:t>
+      </w:r>
+      <w:r>
+        <w:t xml:space="preserve"> </w:t>
+      </w:r>
+      <w:r>
+        <w:t xml:space="preserve">Brawling 14 (blows at speed, Class II).</w:t>
+      </w:r>
+      <w:r>
+        <w:t xml:space="preserve"> </w:t>
+      </w:r>
+      <w:r>
+        <w:rPr>
+          <w:bCs/>
+          <w:b/>
+        </w:rPr>
+        <w:t xml:space="preserve">Dodge</w:t>
+      </w:r>
+      <w:r>
+        <w:t xml:space="preserve"> </w:t>
+      </w:r>
+      <w:r>
+        <w:t xml:space="preserve">14 (a second defense each round).</w:t>
+      </w:r>
+      <w:r>
+        <w:t xml:space="preserve"> </w:t>
+      </w:r>
+      <w:r>
+        <w:rPr>
+          <w:bCs/>
+          <w:b/>
+        </w:rPr>
+        <w:t xml:space="preserve">Boxes</w:t>
+      </w:r>
+      <w:r>
+        <w:t xml:space="preserve"> </w:t>
+      </w:r>
+      <w:r>
+        <w:t xml:space="preserve">4.</w:t>
+      </w:r>
+      <w:r>
+        <w:t xml:space="preserve"> </w:t>
+      </w:r>
+      <w:r>
+        <w:rPr>
+          <w:bCs/>
+          <w:b/>
+        </w:rPr>
+        <w:t xml:space="preserve">Defense</w:t>
+      </w:r>
+      <w:r>
+        <w:t xml:space="preserve"> </w:t>
+      </w:r>
+      <w:r>
+        <w:t xml:space="preserve">I (friction-proof skin).</w:t>
+      </w:r>
+      <w:r>
+        <w:t xml:space="preserve"> </w:t>
+      </w:r>
+      <w:r>
+        <w:rPr>
+          <w:bCs/>
+          <w:b/>
+        </w:rPr>
+        <w:t xml:space="preserve">Powers</w:t>
+      </w:r>
+      <w:r>
+        <w:t xml:space="preserve"> </w:t>
+      </w:r>
+      <w:r>
+        <w:t xml:space="preserve">Speed IV (two actions every round), Toughness I, Adaptation I (friction and wind).</w:t>
+      </w:r>
+      <w:r>
+        <w:t xml:space="preserve"> </w:t>
+      </w:r>
+      <w:r>
+        <w:rPr>
+          <w:bCs/>
+          <w:b/>
+        </w:rPr>
+        <w:t xml:space="preserve">Skills</w:t>
+      </w:r>
+      <w:r>
+        <w:t xml:space="preserve"> </w:t>
+      </w:r>
+      <w:r>
+        <w:t xml:space="preserve">Athletics 15, Persuasion 13, Streetwise 13, Read People 13.</w:t>
+      </w:r>
+      <w:r>
+        <w:t xml:space="preserve"> </w:t>
+      </w:r>
+      <w:r>
+        <w:rPr>
+          <w:bCs/>
+          <w:b/>
+        </w:rPr>
+        <w:t xml:space="preserve">Faster than the fight.</w:t>
+      </w:r>
+      <w:r>
+        <w:t xml:space="preserve"> </w:t>
+      </w:r>
+      <w:r>
+        <w:t xml:space="preserve">Two actions a round, and a second defense. A federal warrant hangs over her: helping her marks Scrutiny.</w:t>
       </w:r>
     </w:p>
     <w:p>
@@ -2485,13 +2684,13 @@
           <w:bCs/>
           <w:b/>
         </w:rPr>
-        <w:t xml:space="preserve">Steel Hawk, about 110.</w:t>
-      </w:r>
-      <w:r>
-        <w:t xml:space="preserve"> </w:t>
-      </w:r>
-      <w:r>
-        <w:t xml:space="preserve">An Olympic athlete and German attorney in Brussels, kidnapped in 1952 while prosecuting a wealthy industrialist and taken to a Foundation black lab. There he was tortured and exposed to an artifact that turned his body to living metal, charged it with a spectral energy, let him regenerate from terrible wounds and stopped him aging. He escaped with no memory of who he had been, and with an anger and a need to control everything around him. He became a mercenary for the Morcain; when he discovered the Foundation’s part in his making, his revenge put him in the crosshairs of governments worldwide. In 2012 he helped Autuarch open the breach, came to regret it, and helped close it.</w:t>
+        <w:t xml:space="preserve">The Green Man (Micky Holt).</w:t>
+      </w:r>
+      <w:r>
+        <w:t xml:space="preserve"> </w:t>
+      </w:r>
+      <w:r>
+        <w:t xml:space="preserve">A struggling folk singer, exposed to something… different on a peyote-driven walkabout in the Southwest. It drove him insane, though he still loves to play. His power over plants raised an impenetrable forest across southern Indiana in a matter of days: from Bloomington to the Ohio River you travel on foot, on horseback or by boat. He offers sanctuary to anyone who swears to protect the Earth and spread its message, and serves only vegetarian meals. Any attempt to burn or harm the forest ends in horror-movie destruction by rampaging plants. The Haven, his refuge for America’s homeless, is the one place he allows fire, for warmth and cooking.</w:t>
       </w:r>
     </w:p>
     <w:p>
@@ -2500,29 +2699,122 @@
       </w:pPr>
       <w:r>
         <w:rPr>
-          <w:bCs/>
-          <w:b/>
-        </w:rPr>
-        <w:t xml:space="preserve">Chat Roux (Red Cat).</w:t>
-      </w:r>
-      <w:r>
-        <w:t xml:space="preserve"> </w:t>
-      </w:r>
-      <w:r>
-        <w:t xml:space="preserve">An officer of a multi-dimensional law enforcement organization, stranded on this Earth when his transport was destroyed during the Umkas invasion. He now works for the French</w:t>
-      </w:r>
-      <w:r>
-        <w:t xml:space="preserve"> </w:t>
-      </w:r>
-      <w:r>
-        <w:rPr>
-          <w:bCs/>
-          <w:b/>
-        </w:rPr>
-        <w:t xml:space="preserve">Affaires spéciales</w:t>
-      </w:r>
-      <w:r>
-        <w:t xml:space="preserve">, undercover behind a holographic mask from an Earth far more advanced than ours. He worries the mask will fail without proper maintenance.</w:t>
+          <w:iCs/>
+          <w:i/>
+        </w:rPr>
+        <w:t xml:space="preserve">Class V.</w:t>
+      </w:r>
+      <w:r>
+        <w:t xml:space="preserve"> </w:t>
+      </w:r>
+      <w:r>
+        <w:rPr>
+          <w:bCs/>
+          <w:b/>
+        </w:rPr>
+        <w:t xml:space="preserve">Attacks</w:t>
+      </w:r>
+      <w:r>
+        <w:t xml:space="preserve"> </w:t>
+      </w:r>
+      <w:r>
+        <w:t xml:space="preserve">Powers 15 (roots and thorns, Class IV in the Mad Forest, III outside it).</w:t>
+      </w:r>
+      <w:r>
+        <w:t xml:space="preserve"> </w:t>
+      </w:r>
+      <w:r>
+        <w:rPr>
+          <w:bCs/>
+          <w:b/>
+        </w:rPr>
+        <w:t xml:space="preserve">Dodge</w:t>
+      </w:r>
+      <w:r>
+        <w:t xml:space="preserve"> </w:t>
+      </w:r>
+      <w:r>
+        <w:t xml:space="preserve">9.</w:t>
+      </w:r>
+      <w:r>
+        <w:t xml:space="preserve"> </w:t>
+      </w:r>
+      <w:r>
+        <w:rPr>
+          <w:bCs/>
+          <w:b/>
+        </w:rPr>
+        <w:t xml:space="preserve">Boxes</w:t>
+      </w:r>
+      <w:r>
+        <w:t xml:space="preserve"> </w:t>
+      </w:r>
+      <w:r>
+        <w:t xml:space="preserve">5.</w:t>
+      </w:r>
+      <w:r>
+        <w:t xml:space="preserve"> </w:t>
+      </w:r>
+      <w:r>
+        <w:rPr>
+          <w:bCs/>
+          <w:b/>
+        </w:rPr>
+        <w:t xml:space="preserve">Defense</w:t>
+      </w:r>
+      <w:r>
+        <w:t xml:space="preserve"> </w:t>
+      </w:r>
+      <w:r>
+        <w:t xml:space="preserve">II (a mantle of bark).</w:t>
+      </w:r>
+      <w:r>
+        <w:t xml:space="preserve"> </w:t>
+      </w:r>
+      <w:r>
+        <w:rPr>
+          <w:bCs/>
+          <w:b/>
+        </w:rPr>
+        <w:t xml:space="preserve">Powers</w:t>
+      </w:r>
+      <w:r>
+        <w:t xml:space="preserve"> </w:t>
+      </w:r>
+      <w:r>
+        <w:t xml:space="preserve">Elemental Control (plants) V inside the Mad Forest, III outside it; Regeneration II; Animal Control II.</w:t>
+      </w:r>
+      <w:r>
+        <w:t xml:space="preserve"> </w:t>
+      </w:r>
+      <w:r>
+        <w:rPr>
+          <w:bCs/>
+          <w:b/>
+        </w:rPr>
+        <w:t xml:space="preserve">Skills</w:t>
+      </w:r>
+      <w:r>
+        <w:t xml:space="preserve"> </w:t>
+      </w:r>
+      <w:r>
+        <w:t xml:space="preserve">Persuasion 13, Read People 12, Medicine 12, Occult 12 (and a fine singing voice).</w:t>
+      </w:r>
+      <w:r>
+        <w:t xml:space="preserve"> </w:t>
+      </w:r>
+      <w:r>
+        <w:rPr>
+          <w:bCs/>
+          <w:b/>
+        </w:rPr>
+        <w:t xml:space="preserve">The forest is his.</w:t>
+      </w:r>
+      <w:r>
+        <w:t xml:space="preserve"> </w:t>
+      </w:r>
+      <w:r>
+        <w:t xml:space="preserve">In the Mad Forest two wildwoods answer him each round he asks. Anyone who burns or harms the forest is the forest’s enemy. Mad: what he wants changes with the song.</w:t>
       </w:r>
     </w:p>
     <w:p>
@@ -2534,41 +2826,26 @@
           <w:bCs/>
           <w:b/>
         </w:rPr>
-        <w:t xml:space="preserve">Vanguard (</w:t>
-      </w:r>
-      <w:r>
-        <w:rPr>
-          <w:bCs/>
-          <w:b/>
-        </w:rPr>
-        <w:t xml:space="preserve">“</w:t>
-      </w:r>
-      <w:r>
-        <w:rPr>
-          <w:bCs/>
-          <w:b/>
-        </w:rPr>
-        <w:t xml:space="preserve">Louis Feslen</w:t>
-      </w:r>
-      <w:r>
-        <w:rPr>
-          <w:bCs/>
-          <w:b/>
-        </w:rPr>
-        <w:t xml:space="preserve">”</w:t>
-      </w:r>
-      <w:r>
-        <w:rPr>
-          <w:bCs/>
-          <w:b/>
-        </w:rPr>
-        <w:t xml:space="preserve">).</w:t>
-      </w:r>
-      <w:r>
-        <w:t xml:space="preserve"> </w:t>
-      </w:r>
-      <w:r>
-        <w:t xml:space="preserve">Able to manifest any firearm he can imagine. Believed to be a French expatriate with military and martial-arts training; wanted by the Affaires spéciales, Interpol, MI5 and ExLAW for at least seventeen deaths worldwide. Rumor says every one of them was a Shadow Earth minion. No one has confirmed it.</w:t>
+        <w:t xml:space="preserve">Michael Lance, 47.</w:t>
+      </w:r>
+      <w:r>
+        <w:t xml:space="preserve"> </w:t>
+      </w:r>
+      <w:r>
+        <w:t xml:space="preserve">A 1940s private investigator pulled into a timeless Limbo during a case in 1946, and released by the breach in 2012. He wields a mystic amulet inherited from his grandfather, bonded to him by the spirit of</w:t>
+      </w:r>
+      <w:r>
+        <w:t xml:space="preserve"> </w:t>
+      </w:r>
+      <w:r>
+        <w:rPr>
+          <w:bCs/>
+          <w:b/>
+        </w:rPr>
+        <w:t xml:space="preserve">Em Antu</w:t>
+      </w:r>
+      <w:r>
+        <w:t xml:space="preserve">, the Egyptian priest and sorcerer who made it. It lights a room, fires a laser that cuts steel, and casts realistic illusions. He has used it against all manner of strange beings in New York’s shadows, and against the duplicates of Shadow Earth.</w:t>
       </w:r>
     </w:p>
     <w:p>
@@ -2577,16 +2854,122 @@
       </w:pPr>
       <w:r>
         <w:rPr>
-          <w:bCs/>
-          <w:b/>
-        </w:rPr>
-        <w:t xml:space="preserve">Abd al-Rahman.</w:t>
-      </w:r>
-      <w:r>
-        <w:t xml:space="preserve"> </w:t>
-      </w:r>
-      <w:r>
-        <w:t xml:space="preserve">An Iranian Operant criminal who opposes the People’s Republic. Remarkably strong, tough and brilliant, he leads a band of mercenaries for the highest bidder. He may be able to teleport; no official source will comment.</w:t>
+          <w:iCs/>
+          <w:i/>
+        </w:rPr>
+        <w:t xml:space="preserve">Class III.</w:t>
+      </w:r>
+      <w:r>
+        <w:t xml:space="preserve"> </w:t>
+      </w:r>
+      <w:r>
+        <w:rPr>
+          <w:bCs/>
+          <w:b/>
+        </w:rPr>
+        <w:t xml:space="preserve">Attacks</w:t>
+      </w:r>
+      <w:r>
+        <w:t xml:space="preserve"> </w:t>
+      </w:r>
+      <w:r>
+        <w:t xml:space="preserve">Firearms 13 (a .38 revolver, Class I); Powers 14 (the amulet’s beam, Blast III).</w:t>
+      </w:r>
+      <w:r>
+        <w:t xml:space="preserve"> </w:t>
+      </w:r>
+      <w:r>
+        <w:rPr>
+          <w:bCs/>
+          <w:b/>
+        </w:rPr>
+        <w:t xml:space="preserve">Dodge</w:t>
+      </w:r>
+      <w:r>
+        <w:t xml:space="preserve"> </w:t>
+      </w:r>
+      <w:r>
+        <w:t xml:space="preserve">11.</w:t>
+      </w:r>
+      <w:r>
+        <w:t xml:space="preserve"> </w:t>
+      </w:r>
+      <w:r>
+        <w:rPr>
+          <w:bCs/>
+          <w:b/>
+        </w:rPr>
+        <w:t xml:space="preserve">Boxes</w:t>
+      </w:r>
+      <w:r>
+        <w:t xml:space="preserve"> </w:t>
+      </w:r>
+      <w:r>
+        <w:t xml:space="preserve">4.</w:t>
+      </w:r>
+      <w:r>
+        <w:t xml:space="preserve"> </w:t>
+      </w:r>
+      <w:r>
+        <w:rPr>
+          <w:bCs/>
+          <w:b/>
+        </w:rPr>
+        <w:t xml:space="preserve">Defense</w:t>
+      </w:r>
+      <w:r>
+        <w:t xml:space="preserve"> </w:t>
+      </w:r>
+      <w:r>
+        <w:t xml:space="preserve">none.</w:t>
+      </w:r>
+      <w:r>
+        <w:t xml:space="preserve"> </w:t>
+      </w:r>
+      <w:r>
+        <w:rPr>
+          <w:bCs/>
+          <w:b/>
+        </w:rPr>
+        <w:t xml:space="preserve">Powers</w:t>
+      </w:r>
+      <w:r>
+        <w:t xml:space="preserve"> </w:t>
+      </w:r>
+      <w:r>
+        <w:t xml:space="preserve">through Em Antu’s amulet: Blast III (a light that cuts steel), Illusion III, Mystic Sight II, light at will.</w:t>
+      </w:r>
+      <w:r>
+        <w:t xml:space="preserve"> </w:t>
+      </w:r>
+      <w:r>
+        <w:rPr>
+          <w:bCs/>
+          <w:b/>
+        </w:rPr>
+        <w:t xml:space="preserve">Skills</w:t>
+      </w:r>
+      <w:r>
+        <w:t xml:space="preserve"> </w:t>
+      </w:r>
+      <w:r>
+        <w:t xml:space="preserve">Investigation 15, Streetwise 14, Firearms 13, Occult 12.</w:t>
+      </w:r>
+      <w:r>
+        <w:t xml:space="preserve"> </w:t>
+      </w:r>
+      <w:r>
+        <w:rPr>
+          <w:bCs/>
+          <w:b/>
+        </w:rPr>
+        <w:t xml:space="preserve">The amulet.</w:t>
+      </w:r>
+      <w:r>
+        <w:t xml:space="preserve"> </w:t>
+      </w:r>
+      <w:r>
+        <w:t xml:space="preserve">Without the amulet he’s a 1940s private eye with a revolver. Em Antu’s spirit has its own opinions, and sometimes its own plans.</w:t>
       </w:r>
     </w:p>
     <w:p>
@@ -2598,13 +2981,13 @@
           <w:bCs/>
           <w:b/>
         </w:rPr>
-        <w:t xml:space="preserve">The Golden Centurion, about 2,050.</w:t>
-      </w:r>
-      <w:r>
-        <w:t xml:space="preserve"> </w:t>
-      </w:r>
-      <w:r>
-        <w:t xml:space="preserve">An immortal warrior born in ancient Rome, cursed (the current story goes) by Jupiter to wander the Earth unaging for his crimes against the gods, running off with a Vestal Virgin among them. He regenerates quickly, is incredibly tough and cannot die; but he feels everything, even when his head is cut off. Brutal and unyielding in his moral code, he gives himself entirely to whichever cause he chooses.</w:t>
+        <w:t xml:space="preserve">Steel Hawk, about 110.</w:t>
+      </w:r>
+      <w:r>
+        <w:t xml:space="preserve"> </w:t>
+      </w:r>
+      <w:r>
+        <w:t xml:space="preserve">An Olympic athlete and German attorney in Brussels, kidnapped in 1952 while prosecuting a wealthy industrialist and taken to a Foundation black lab. There he was tortured and exposed to an artifact that turned his body to living metal, charged it with a spectral energy, let him regenerate from terrible wounds and stopped him aging. He escaped with no memory of who he had been, and with an anger and a need to control everything around him. He became a mercenary for the Morcain; when he discovered the Foundation’s part in his making, his revenge put him in the crosshairs of governments worldwide. In 2012 he helped Autuarch open the breach, came to regret it, and helped close it.</w:t>
       </w:r>
     </w:p>
     <w:p>
@@ -2613,29 +2996,122 @@
       </w:pPr>
       <w:r>
         <w:rPr>
-          <w:bCs/>
-          <w:b/>
-        </w:rPr>
-        <w:t xml:space="preserve">The Shadow Knight (Grant Douglas).</w:t>
-      </w:r>
-      <w:r>
-        <w:t xml:space="preserve"> </w:t>
-      </w:r>
-      <w:r>
-        <w:t xml:space="preserve">The North American Knight of the</w:t>
-      </w:r>
-      <w:r>
-        <w:t xml:space="preserve"> </w:t>
-      </w:r>
-      <w:r>
-        <w:rPr>
           <w:iCs/>
           <w:i/>
         </w:rPr>
-        <w:t xml:space="preserve">Ordo Viarum Lucidarum</w:t>
-      </w:r>
-      <w:r>
-        <w:t xml:space="preserve">: a former Marine and mercenary who somehow came into possession of several supernatural artifacts. He leads a small team of specialists in a private war against monsters and Operants who threaten human lives.</w:t>
+        <w:t xml:space="preserve">Class IV.</w:t>
+      </w:r>
+      <w:r>
+        <w:t xml:space="preserve"> </w:t>
+      </w:r>
+      <w:r>
+        <w:rPr>
+          <w:bCs/>
+          <w:b/>
+        </w:rPr>
+        <w:t xml:space="preserve">Attacks</w:t>
+      </w:r>
+      <w:r>
+        <w:t xml:space="preserve"> </w:t>
+      </w:r>
+      <w:r>
+        <w:t xml:space="preserve">Brawling 15 (Strength III); Powers 15 (spectral energy, Blast IV).</w:t>
+      </w:r>
+      <w:r>
+        <w:t xml:space="preserve"> </w:t>
+      </w:r>
+      <w:r>
+        <w:rPr>
+          <w:bCs/>
+          <w:b/>
+        </w:rPr>
+        <w:t xml:space="preserve">Dodge</w:t>
+      </w:r>
+      <w:r>
+        <w:t xml:space="preserve"> </w:t>
+      </w:r>
+      <w:r>
+        <w:t xml:space="preserve">10.</w:t>
+      </w:r>
+      <w:r>
+        <w:t xml:space="preserve"> </w:t>
+      </w:r>
+      <w:r>
+        <w:rPr>
+          <w:bCs/>
+          <w:b/>
+        </w:rPr>
+        <w:t xml:space="preserve">Boxes</w:t>
+      </w:r>
+      <w:r>
+        <w:t xml:space="preserve"> </w:t>
+      </w:r>
+      <w:r>
+        <w:t xml:space="preserve">5.</w:t>
+      </w:r>
+      <w:r>
+        <w:t xml:space="preserve"> </w:t>
+      </w:r>
+      <w:r>
+        <w:rPr>
+          <w:bCs/>
+          <w:b/>
+        </w:rPr>
+        <w:t xml:space="preserve">Defense</w:t>
+      </w:r>
+      <w:r>
+        <w:t xml:space="preserve"> </w:t>
+      </w:r>
+      <w:r>
+        <w:t xml:space="preserve">IV (living metal).</w:t>
+      </w:r>
+      <w:r>
+        <w:t xml:space="preserve"> </w:t>
+      </w:r>
+      <w:r>
+        <w:rPr>
+          <w:bCs/>
+          <w:b/>
+        </w:rPr>
+        <w:t xml:space="preserve">Powers</w:t>
+      </w:r>
+      <w:r>
+        <w:t xml:space="preserve"> </w:t>
+      </w:r>
+      <w:r>
+        <w:t xml:space="preserve">Toughness IV, Strength III, Blast IV, Regeneration III, Flight II, Immortality (ageless only).</w:t>
+      </w:r>
+      <w:r>
+        <w:t xml:space="preserve"> </w:t>
+      </w:r>
+      <w:r>
+        <w:rPr>
+          <w:bCs/>
+          <w:b/>
+        </w:rPr>
+        <w:t xml:space="preserve">Skills</w:t>
+      </w:r>
+      <w:r>
+        <w:t xml:space="preserve"> </w:t>
+      </w:r>
+      <w:r>
+        <w:t xml:space="preserve">Law 14, Athletics 14, Leadership 13, Firearms 13.</w:t>
+      </w:r>
+      <w:r>
+        <w:t xml:space="preserve"> </w:t>
+      </w:r>
+      <w:r>
+        <w:rPr>
+          <w:bCs/>
+          <w:b/>
+        </w:rPr>
+        <w:t xml:space="preserve">Control.</w:t>
+      </w:r>
+      <w:r>
+        <w:t xml:space="preserve"> </w:t>
+      </w:r>
+      <w:r>
+        <w:t xml:space="preserve">He must run every room he’s in. Orders make him dig in; a deal that leaves him in charge can buy him for a while.</w:t>
       </w:r>
     </w:p>
     <w:p>
@@ -2647,13 +3123,26 @@
           <w:bCs/>
           <w:b/>
         </w:rPr>
-        <w:t xml:space="preserve">Lord Marrow (Altari Marrow).</w:t>
-      </w:r>
-      <w:r>
-        <w:t xml:space="preserve"> </w:t>
-      </w:r>
-      <w:r>
-        <w:t xml:space="preserve">A self-proclaimed magus with illusory and telepathic powers, who brings his victims’ fears to life. He can’t control minds, but he can terrify people into handing over money, jewels or secrets his weak mental scans can’t find. Strong minds resist him, so he researches his victims to find the perfect fear. He lives somewhere in Europe and works for the Morcain on special occasions; his reliance on horror-film images betrays a lack of imagination.</w:t>
+        <w:t xml:space="preserve">Chat Roux (Red Cat).</w:t>
+      </w:r>
+      <w:r>
+        <w:t xml:space="preserve"> </w:t>
+      </w:r>
+      <w:r>
+        <w:t xml:space="preserve">An officer of a multi-dimensional law enforcement organization, stranded on this Earth when his transport was destroyed during the Umkas invasion. He now works for the French</w:t>
+      </w:r>
+      <w:r>
+        <w:t xml:space="preserve"> </w:t>
+      </w:r>
+      <w:r>
+        <w:rPr>
+          <w:bCs/>
+          <w:b/>
+        </w:rPr>
+        <w:t xml:space="preserve">Affaires spéciales</w:t>
+      </w:r>
+      <w:r>
+        <w:t xml:space="preserve">, undercover behind a holographic mask from an Earth far more advanced than ours. He worries the mask will fail without proper maintenance.</w:t>
       </w:r>
     </w:p>
     <w:p>
@@ -2662,42 +3151,292 @@
       </w:pPr>
       <w:r>
         <w:rPr>
-          <w:bCs/>
-          <w:b/>
-        </w:rPr>
-        <w:t xml:space="preserve">The Ice Reaper (Hyun Wang).</w:t>
-      </w:r>
-      <w:r>
-        <w:t xml:space="preserve"> </w:t>
-      </w:r>
-      <w:r>
-        <w:t xml:space="preserve">A South Korean gangster who found an artifact that bonded an</w:t>
-      </w:r>
-      <w:r>
-        <w:t xml:space="preserve"> </w:t>
-      </w:r>
-      <w:r>
-        <w:rPr>
           <w:iCs/>
           <w:i/>
         </w:rPr>
-        <w:t xml:space="preserve">aleum sasin</w:t>
-      </w:r>
-      <w:r>
-        <w:t xml:space="preserve">, an Ice Reaper, to him. He can become the bloodthirsty spirit at will, and used it to become the</w:t>
-      </w:r>
-      <w:r>
-        <w:t xml:space="preserve"> </w:t>
-      </w:r>
+        <w:t xml:space="preserve">Class II.</w:t>
+      </w:r>
+      <w:r>
+        <w:t xml:space="preserve"> </w:t>
+      </w:r>
+      <w:r>
+        <w:rPr>
+          <w:bCs/>
+          <w:b/>
+        </w:rPr>
+        <w:t xml:space="preserve">Attacks</w:t>
+      </w:r>
+      <w:r>
+        <w:t xml:space="preserve"> </w:t>
+      </w:r>
+      <w:r>
+        <w:t xml:space="preserve">Firearms 14 (dimensional sidearm, Class II); Brawling 13 (unarmed, Class I).</w:t>
+      </w:r>
+      <w:r>
+        <w:t xml:space="preserve"> </w:t>
+      </w:r>
+      <w:r>
+        <w:rPr>
+          <w:bCs/>
+          <w:b/>
+        </w:rPr>
+        <w:t xml:space="preserve">Dodge</w:t>
+      </w:r>
+      <w:r>
+        <w:t xml:space="preserve"> </w:t>
+      </w:r>
+      <w:r>
+        <w:t xml:space="preserve">12.</w:t>
+      </w:r>
+      <w:r>
+        <w:t xml:space="preserve"> </w:t>
+      </w:r>
+      <w:r>
+        <w:rPr>
+          <w:bCs/>
+          <w:b/>
+        </w:rPr>
+        <w:t xml:space="preserve">Boxes</w:t>
+      </w:r>
+      <w:r>
+        <w:t xml:space="preserve"> </w:t>
+      </w:r>
+      <w:r>
+        <w:t xml:space="preserve">4.</w:t>
+      </w:r>
+      <w:r>
+        <w:t xml:space="preserve"> </w:t>
+      </w:r>
+      <w:r>
+        <w:rPr>
+          <w:bCs/>
+          <w:b/>
+        </w:rPr>
+        <w:t xml:space="preserve">Defense</w:t>
+      </w:r>
+      <w:r>
+        <w:t xml:space="preserve"> </w:t>
+      </w:r>
+      <w:r>
+        <w:t xml:space="preserve">I (uniform armor).</w:t>
+      </w:r>
+      <w:r>
+        <w:t xml:space="preserve"> </w:t>
+      </w:r>
+      <w:r>
+        <w:rPr>
+          <w:bCs/>
+          <w:b/>
+        </w:rPr>
+        <w:t xml:space="preserve">Powers</w:t>
+      </w:r>
+      <w:r>
+        <w:t xml:space="preserve"> </w:t>
+      </w:r>
+      <w:r>
+        <w:t xml:space="preserve">no powers of his own; an advanced holographic mask (Illusion II: any face), a dimensional sidearm (Class II) and armor (Defense I).</w:t>
+      </w:r>
+      <w:r>
+        <w:t xml:space="preserve"> </w:t>
+      </w:r>
+      <w:r>
+        <w:rPr>
+          <w:bCs/>
+          <w:b/>
+        </w:rPr>
+        <w:t xml:space="preserve">Skills</w:t>
+      </w:r>
+      <w:r>
+        <w:t xml:space="preserve"> </w:t>
+      </w:r>
+      <w:r>
+        <w:t xml:space="preserve">Investigation 14, Stealth 14, Law 13, Engineering 12.</w:t>
+      </w:r>
+      <w:r>
+        <w:t xml:space="preserve"> </w:t>
+      </w:r>
+      <w:r>
+        <w:rPr>
+          <w:bCs/>
+          <w:b/>
+        </w:rPr>
+        <w:t xml:space="preserve">The mask.</w:t>
+      </w:r>
+      <w:r>
+        <w:t xml:space="preserve"> </w:t>
+      </w:r>
+      <w:r>
+        <w:t xml:space="preserve">On a natural 17 or 18 with Deception, the mask flickers. Without repairs from his own Earth, one day it will fail for good.</w:t>
+      </w:r>
+    </w:p>
+    <w:p>
+      <w:pPr>
+        <w:pStyle w:val="BodyText"/>
+      </w:pPr>
+      <w:r>
+        <w:rPr>
+          <w:bCs/>
+          <w:b/>
+        </w:rPr>
+        <w:t xml:space="preserve">Vanguard (</w:t>
+      </w:r>
+      <w:r>
+        <w:rPr>
+          <w:bCs/>
+          <w:b/>
+        </w:rPr>
+        <w:t xml:space="preserve">“</w:t>
+      </w:r>
+      <w:r>
+        <w:rPr>
+          <w:bCs/>
+          <w:b/>
+        </w:rPr>
+        <w:t xml:space="preserve">Louis Feslen</w:t>
+      </w:r>
+      <w:r>
+        <w:rPr>
+          <w:bCs/>
+          <w:b/>
+        </w:rPr>
+        <w:t xml:space="preserve">”</w:t>
+      </w:r>
+      <w:r>
+        <w:rPr>
+          <w:bCs/>
+          <w:b/>
+        </w:rPr>
+        <w:t xml:space="preserve">).</w:t>
+      </w:r>
+      <w:r>
+        <w:t xml:space="preserve"> </w:t>
+      </w:r>
+      <w:r>
+        <w:t xml:space="preserve">Able to manifest any firearm he can imagine. Believed to be a French expatriate with military and martial-arts training; wanted by the Affaires spéciales, Interpol, MI5 and ExLAW for at least seventeen deaths worldwide. Rumor says every one of them was a Shadow Earth minion. No one has confirmed it.</w:t>
+      </w:r>
+    </w:p>
+    <w:p>
+      <w:pPr>
+        <w:pStyle w:val="BodyText"/>
+      </w:pPr>
       <w:r>
         <w:rPr>
           <w:iCs/>
           <w:i/>
         </w:rPr>
-        <w:t xml:space="preserve">Sangsanim</w:t>
-      </w:r>
-      <w:r>
-        <w:t xml:space="preserve">, boss of his country’s underworld. He sits on the 12.</w:t>
+        <w:t xml:space="preserve">Class III.</w:t>
+      </w:r>
+      <w:r>
+        <w:t xml:space="preserve"> </w:t>
+      </w:r>
+      <w:r>
+        <w:rPr>
+          <w:bCs/>
+          <w:b/>
+        </w:rPr>
+        <w:t xml:space="preserve">Attacks</w:t>
+      </w:r>
+      <w:r>
+        <w:t xml:space="preserve"> </w:t>
+      </w:r>
+      <w:r>
+        <w:t xml:space="preserve">Firearms 16 (a manifested firearm, Class III); Brawling 14 (martial arts, Class I).</w:t>
+      </w:r>
+      <w:r>
+        <w:t xml:space="preserve"> </w:t>
+      </w:r>
+      <w:r>
+        <w:rPr>
+          <w:bCs/>
+          <w:b/>
+        </w:rPr>
+        <w:t xml:space="preserve">Dodge</w:t>
+      </w:r>
+      <w:r>
+        <w:t xml:space="preserve"> </w:t>
+      </w:r>
+      <w:r>
+        <w:t xml:space="preserve">12.</w:t>
+      </w:r>
+      <w:r>
+        <w:t xml:space="preserve"> </w:t>
+      </w:r>
+      <w:r>
+        <w:rPr>
+          <w:bCs/>
+          <w:b/>
+        </w:rPr>
+        <w:t xml:space="preserve">Boxes</w:t>
+      </w:r>
+      <w:r>
+        <w:t xml:space="preserve"> </w:t>
+      </w:r>
+      <w:r>
+        <w:t xml:space="preserve">4.</w:t>
+      </w:r>
+      <w:r>
+        <w:t xml:space="preserve"> </w:t>
+      </w:r>
+      <w:r>
+        <w:rPr>
+          <w:bCs/>
+          <w:b/>
+        </w:rPr>
+        <w:t xml:space="preserve">Defense</w:t>
+      </w:r>
+      <w:r>
+        <w:t xml:space="preserve"> </w:t>
+      </w:r>
+      <w:r>
+        <w:t xml:space="preserve">I (manifested body armor).</w:t>
+      </w:r>
+      <w:r>
+        <w:t xml:space="preserve"> </w:t>
+      </w:r>
+      <w:r>
+        <w:rPr>
+          <w:bCs/>
+          <w:b/>
+        </w:rPr>
+        <w:t xml:space="preserve">Powers</w:t>
+      </w:r>
+      <w:r>
+        <w:t xml:space="preserve"> </w:t>
+      </w:r>
+      <w:r>
+        <w:t xml:space="preserve">Manifest III (any firearm he can imagine, and its ammunition).</w:t>
+      </w:r>
+      <w:r>
+        <w:t xml:space="preserve"> </w:t>
+      </w:r>
+      <w:r>
+        <w:rPr>
+          <w:bCs/>
+          <w:b/>
+        </w:rPr>
+        <w:t xml:space="preserve">Skills</w:t>
+      </w:r>
+      <w:r>
+        <w:t xml:space="preserve"> </w:t>
+      </w:r>
+      <w:r>
+        <w:t xml:space="preserve">Firearms 16, Brawling 14, Stealth 14, Athletics 13.</w:t>
+      </w:r>
+      <w:r>
+        <w:t xml:space="preserve"> </w:t>
+      </w:r>
+      <w:r>
+        <w:rPr>
+          <w:bCs/>
+          <w:b/>
+        </w:rPr>
+        <w:t xml:space="preserve">Seventeen kills.</w:t>
+      </w:r>
+      <w:r>
+        <w:t xml:space="preserve"> </w:t>
+      </w:r>
+      <w:r>
+        <w:t xml:space="preserve">Wanted on four continents. If the rumor is true, every target was a Shadow Earth duplicate, and he knows how to spot them.</w:t>
       </w:r>
     </w:p>
     <w:p>
@@ -2709,13 +3448,13 @@
           <w:bCs/>
           <w:b/>
         </w:rPr>
-        <w:t xml:space="preserve">Helios (David Carlysle Jones), 44.</w:t>
-      </w:r>
-      <w:r>
-        <w:t xml:space="preserve"> </w:t>
-      </w:r>
-      <w:r>
-        <w:t xml:space="preserve">A former Army major recruited into DIRE and given a heavily modified Ambrosia. The transformation was agonizing, and made him one of the most powerful Operants alive: he absorbs and redirects sunlight as energy blasts or flight, and is nearly invulnerable and remarkably strong. His weakness: eight hours without sunlight (the moon and stars don’t count) leave him near human.</w:t>
+        <w:t xml:space="preserve">Abd al-Rahman.</w:t>
+      </w:r>
+      <w:r>
+        <w:t xml:space="preserve"> </w:t>
+      </w:r>
+      <w:r>
+        <w:t xml:space="preserve">An Iranian Operant criminal who opposes the People’s Republic. Remarkably strong, tough and brilliant, he leads a band of mercenaries for the highest bidder. He may be able to teleport; no official source will comment.</w:t>
       </w:r>
     </w:p>
     <w:p>
@@ -2724,16 +3463,122 @@
       </w:pPr>
       <w:r>
         <w:rPr>
-          <w:bCs/>
-          <w:b/>
-        </w:rPr>
-        <w:t xml:space="preserve">Zephyr (Dr. Alemayehu Okafor).</w:t>
-      </w:r>
-      <w:r>
-        <w:t xml:space="preserve"> </w:t>
-      </w:r>
-      <w:r>
-        <w:t xml:space="preserve">A famed Ethiopian archaeologist who pursues cryptozoological artifacts with militant zeal. A native Operant with heightened strength and resilience and the power to control the air, he is an avowed environmentalist, wanted in several countries for alleged attacks on industrial and mining concerns in Africa.</w:t>
+          <w:iCs/>
+          <w:i/>
+        </w:rPr>
+        <w:t xml:space="preserve">Class IV.</w:t>
+      </w:r>
+      <w:r>
+        <w:t xml:space="preserve"> </w:t>
+      </w:r>
+      <w:r>
+        <w:rPr>
+          <w:bCs/>
+          <w:b/>
+        </w:rPr>
+        <w:t xml:space="preserve">Attacks</w:t>
+      </w:r>
+      <w:r>
+        <w:t xml:space="preserve"> </w:t>
+      </w:r>
+      <w:r>
+        <w:t xml:space="preserve">Brawling 15 (Strength IV); Firearms 13 (rifle, Class I).</w:t>
+      </w:r>
+      <w:r>
+        <w:t xml:space="preserve"> </w:t>
+      </w:r>
+      <w:r>
+        <w:rPr>
+          <w:bCs/>
+          <w:b/>
+        </w:rPr>
+        <w:t xml:space="preserve">Dodge</w:t>
+      </w:r>
+      <w:r>
+        <w:t xml:space="preserve"> </w:t>
+      </w:r>
+      <w:r>
+        <w:t xml:space="preserve">10.</w:t>
+      </w:r>
+      <w:r>
+        <w:t xml:space="preserve"> </w:t>
+      </w:r>
+      <w:r>
+        <w:rPr>
+          <w:bCs/>
+          <w:b/>
+        </w:rPr>
+        <w:t xml:space="preserve">Boxes</w:t>
+      </w:r>
+      <w:r>
+        <w:t xml:space="preserve"> </w:t>
+      </w:r>
+      <w:r>
+        <w:t xml:space="preserve">5.</w:t>
+      </w:r>
+      <w:r>
+        <w:t xml:space="preserve"> </w:t>
+      </w:r>
+      <w:r>
+        <w:rPr>
+          <w:bCs/>
+          <w:b/>
+        </w:rPr>
+        <w:t xml:space="preserve">Defense</w:t>
+      </w:r>
+      <w:r>
+        <w:t xml:space="preserve"> </w:t>
+      </w:r>
+      <w:r>
+        <w:t xml:space="preserve">III (Toughness).</w:t>
+      </w:r>
+      <w:r>
+        <w:t xml:space="preserve"> </w:t>
+      </w:r>
+      <w:r>
+        <w:rPr>
+          <w:bCs/>
+          <w:b/>
+        </w:rPr>
+        <w:t xml:space="preserve">Powers</w:t>
+      </w:r>
+      <w:r>
+        <w:t xml:space="preserve"> </w:t>
+      </w:r>
+      <w:r>
+        <w:t xml:space="preserve">Strength IV, Toughness III, Super Intellect II, Teleport II (rumored, and true).</w:t>
+      </w:r>
+      <w:r>
+        <w:t xml:space="preserve"> </w:t>
+      </w:r>
+      <w:r>
+        <w:rPr>
+          <w:bCs/>
+          <w:b/>
+        </w:rPr>
+        <w:t xml:space="preserve">Skills</w:t>
+      </w:r>
+      <w:r>
+        <w:t xml:space="preserve"> </w:t>
+      </w:r>
+      <w:r>
+        <w:t xml:space="preserve">Leadership 15, Science 14, Firearms 13, Persuasion 13.</w:t>
+      </w:r>
+      <w:r>
+        <w:t xml:space="preserve"> </w:t>
+      </w:r>
+      <w:r>
+        <w:rPr>
+          <w:bCs/>
+          <w:b/>
+        </w:rPr>
+        <w:t xml:space="preserve">Mercenary leader.</w:t>
+      </w:r>
+      <w:r>
+        <w:t xml:space="preserve"> </w:t>
+      </w:r>
+      <w:r>
+        <w:t xml:space="preserve">Never alone: four Morcain enforcers’ worth of mercenaries. Once a fight, he Teleports out with one passenger.</w:t>
       </w:r>
     </w:p>
     <w:p>
@@ -2745,26 +3590,13 @@
           <w:bCs/>
           <w:b/>
         </w:rPr>
-        <w:t xml:space="preserve">Evelyn Dark, 25.</w:t>
-      </w:r>
-      <w:r>
-        <w:t xml:space="preserve"> </w:t>
-      </w:r>
-      <w:r>
-        <w:t xml:space="preserve">Born in Avalon to a line of witches descended from Hecate and Freya, with a rare gift for manipulating energy and matter. A seer foretold she would bring Avalon’s doom, and at thirteen she fled to Earth in defiance of the Accords. She gathered homeless children into a ring of thieves and con artists, the</w:t>
-      </w:r>
-      <w:r>
-        <w:t xml:space="preserve"> </w:t>
-      </w:r>
-      <w:r>
-        <w:rPr>
-          <w:bCs/>
-          <w:b/>
-        </w:rPr>
-        <w:t xml:space="preserve">Dark Ones</w:t>
-      </w:r>
-      <w:r>
-        <w:t xml:space="preserve">, until the Foundation caught her two years later. Its experiments heightened and destabilized her powers; one destroyed the lab and the town around it, and she was the only survivor. In the decade since, she has used her powers sparingly, helping where she can and hiding from Earth’s most powerful magic users.</w:t>
+        <w:t xml:space="preserve">The Golden Centurion, about 2,050.</w:t>
+      </w:r>
+      <w:r>
+        <w:t xml:space="preserve"> </w:t>
+      </w:r>
+      <w:r>
+        <w:t xml:space="preserve">An immortal warrior born in ancient Rome, cursed (the current story goes) by Jupiter to wander the Earth unaging for his crimes against the gods, running off with a Vestal Virgin among them. He regenerates quickly, is incredibly tough and cannot die; but he feels everything, even when his head is cut off. Brutal and unyielding in his moral code, he gives himself entirely to whichever cause he chooses.</w:t>
       </w:r>
     </w:p>
     <w:p>
@@ -2773,16 +3605,122 @@
       </w:pPr>
       <w:r>
         <w:rPr>
-          <w:bCs/>
-          <w:b/>
-        </w:rPr>
-        <w:t xml:space="preserve">Milon Dubinsky, about 650.</w:t>
-      </w:r>
-      <w:r>
-        <w:t xml:space="preserve"> </w:t>
-      </w:r>
-      <w:r>
-        <w:t xml:space="preserve">Once a king in what is now Romania, who killed every man in a conquered village so he could marry the chieftain’s wife. She poisoned him before the wedding, and when he begged for a cure, cursed him to undying life as a wolfman, unable to return to human form. He found he could share part of his curse with the descendants of his tribe (supernaturally tough and able to change back, but mortal), and over six centuries has built a small army of werewolves to do his bidding.</w:t>
+          <w:iCs/>
+          <w:i/>
+        </w:rPr>
+        <w:t xml:space="preserve">Class V.</w:t>
+      </w:r>
+      <w:r>
+        <w:t xml:space="preserve"> </w:t>
+      </w:r>
+      <w:r>
+        <w:rPr>
+          <w:bCs/>
+          <w:b/>
+        </w:rPr>
+        <w:t xml:space="preserve">Attacks</w:t>
+      </w:r>
+      <w:r>
+        <w:t xml:space="preserve"> </w:t>
+      </w:r>
+      <w:r>
+        <w:t xml:space="preserve">Melee 16 (gladius and strength, Class IV).</w:t>
+      </w:r>
+      <w:r>
+        <w:t xml:space="preserve"> </w:t>
+      </w:r>
+      <w:r>
+        <w:rPr>
+          <w:bCs/>
+          <w:b/>
+        </w:rPr>
+        <w:t xml:space="preserve">Dodge</w:t>
+      </w:r>
+      <w:r>
+        <w:t xml:space="preserve"> </w:t>
+      </w:r>
+      <w:r>
+        <w:t xml:space="preserve">11.</w:t>
+      </w:r>
+      <w:r>
+        <w:t xml:space="preserve"> </w:t>
+      </w:r>
+      <w:r>
+        <w:rPr>
+          <w:bCs/>
+          <w:b/>
+        </w:rPr>
+        <w:t xml:space="preserve">Boxes</w:t>
+      </w:r>
+      <w:r>
+        <w:t xml:space="preserve"> </w:t>
+      </w:r>
+      <w:r>
+        <w:t xml:space="preserve">6.</w:t>
+      </w:r>
+      <w:r>
+        <w:t xml:space="preserve"> </w:t>
+      </w:r>
+      <w:r>
+        <w:rPr>
+          <w:bCs/>
+          <w:b/>
+        </w:rPr>
+        <w:t xml:space="preserve">Defense</w:t>
+      </w:r>
+      <w:r>
+        <w:t xml:space="preserve"> </w:t>
+      </w:r>
+      <w:r>
+        <w:t xml:space="preserve">IV (Toughness).</w:t>
+      </w:r>
+      <w:r>
+        <w:t xml:space="preserve"> </w:t>
+      </w:r>
+      <w:r>
+        <w:rPr>
+          <w:bCs/>
+          <w:b/>
+        </w:rPr>
+        <w:t xml:space="preserve">Powers</w:t>
+      </w:r>
+      <w:r>
+        <w:t xml:space="preserve"> </w:t>
+      </w:r>
+      <w:r>
+        <w:t xml:space="preserve">Toughness IV, Strength IV, Regeneration V, Immortality V (Mythic).</w:t>
+      </w:r>
+      <w:r>
+        <w:t xml:space="preserve"> </w:t>
+      </w:r>
+      <w:r>
+        <w:rPr>
+          <w:bCs/>
+          <w:b/>
+        </w:rPr>
+        <w:t xml:space="preserve">Skills</w:t>
+      </w:r>
+      <w:r>
+        <w:t xml:space="preserve"> </w:t>
+      </w:r>
+      <w:r>
+        <w:t xml:space="preserve">Melee 16, Athletics 15, Leadership 13, Occult 12.</w:t>
+      </w:r>
+      <w:r>
+        <w:t xml:space="preserve"> </w:t>
+      </w:r>
+      <w:r>
+        <w:rPr>
+          <w:bCs/>
+          <w:b/>
+        </w:rPr>
+        <w:t xml:space="preserve">Cannot die.</w:t>
+      </w:r>
+      <w:r>
+        <w:t xml:space="preserve"> </w:t>
+      </w:r>
+      <w:r>
+        <w:t xml:space="preserve">He clears a box every turn and comes back within an hour from anything, but he feels every wound. His code is iron: he never breaks his word, or forgives a broken one.</w:t>
       </w:r>
     </w:p>
     <w:p>
@@ -2794,13 +3732,26 @@
           <w:bCs/>
           <w:b/>
         </w:rPr>
-        <w:t xml:space="preserve">Nikola Tesla, 169.</w:t>
-      </w:r>
-      <w:r>
-        <w:t xml:space="preserve"> </w:t>
-      </w:r>
-      <w:r>
-        <w:t xml:space="preserve">Rarely on our Earth now. He prefers his pocket dimension, 1884 Ivry-sur-Seine, where his laboratory has doors to many other dimensions, Shadow Earth among them. He experiments with inventions to enhance or modify Operant abilities, including the metatropic manipulations called magic. He has devised a way to trap Richard Kennedy, and hasn’t used it: he doesn’t want to interrupt the man’s good works.</w:t>
+        <w:t xml:space="preserve">The Shadow Knight (Grant Douglas).</w:t>
+      </w:r>
+      <w:r>
+        <w:t xml:space="preserve"> </w:t>
+      </w:r>
+      <w:r>
+        <w:t xml:space="preserve">The North American Knight of the</w:t>
+      </w:r>
+      <w:r>
+        <w:t xml:space="preserve"> </w:t>
+      </w:r>
+      <w:r>
+        <w:rPr>
+          <w:iCs/>
+          <w:i/>
+        </w:rPr>
+        <w:t xml:space="preserve">Ordo Viarum Lucidarum</w:t>
+      </w:r>
+      <w:r>
+        <w:t xml:space="preserve">: a former Marine and mercenary who somehow came into possession of several supernatural artifacts. He leads a small team of specialists in a private war against monsters and Operants who threaten human lives.</w:t>
       </w:r>
     </w:p>
     <w:p>
@@ -2809,16 +3760,122 @@
       </w:pPr>
       <w:r>
         <w:rPr>
-          <w:bCs/>
-          <w:b/>
-        </w:rPr>
-        <w:t xml:space="preserve">The Atomic Man (Dr. Richard Kennedy), about 100.</w:t>
-      </w:r>
-      <w:r>
-        <w:t xml:space="preserve"> </w:t>
-      </w:r>
-      <w:r>
-        <w:t xml:space="preserve">A nuclear scientist and cousin of the political dynasty, irradiated in 1959 when he pushed his colleagues to safety from a runaway reactor. As he lay dying, an interdimensional entity offered to bond with him so he could continue his work and protect his world. He agreed, and was healed: he controls the strong and weak nuclear forces around him, and his mind holds the entity’s intellect as well as his own. Strength, speed, invulnerability, energy blasts, flight. He doesn’t seem to age, though in 2024 he found a grey hair. He supports democratic causes worldwide, protects civilians in war, and has destroyed whole arsenals to free nations from oppression. The US, China and Russia once built a weapon together to kill him; it failed. Only Sergei Grachyov has stood against him, in the 2007 battle that destroyed the Washington Monument. Grachyov’s rumored cancers are blamed on Kennedy.</w:t>
+          <w:iCs/>
+          <w:i/>
+        </w:rPr>
+        <w:t xml:space="preserve">Class III.</w:t>
+      </w:r>
+      <w:r>
+        <w:t xml:space="preserve"> </w:t>
+      </w:r>
+      <w:r>
+        <w:rPr>
+          <w:bCs/>
+          <w:b/>
+        </w:rPr>
+        <w:t xml:space="preserve">Attacks</w:t>
+      </w:r>
+      <w:r>
+        <w:t xml:space="preserve"> </w:t>
+      </w:r>
+      <w:r>
+        <w:t xml:space="preserve">Melee 15 (consecrated blade, Class III); Firearms 14 (sidearm, Class I).</w:t>
+      </w:r>
+      <w:r>
+        <w:t xml:space="preserve"> </w:t>
+      </w:r>
+      <w:r>
+        <w:rPr>
+          <w:bCs/>
+          <w:b/>
+        </w:rPr>
+        <w:t xml:space="preserve">Dodge</w:t>
+      </w:r>
+      <w:r>
+        <w:t xml:space="preserve"> </w:t>
+      </w:r>
+      <w:r>
+        <w:t xml:space="preserve">11.</w:t>
+      </w:r>
+      <w:r>
+        <w:t xml:space="preserve"> </w:t>
+      </w:r>
+      <w:r>
+        <w:rPr>
+          <w:bCs/>
+          <w:b/>
+        </w:rPr>
+        <w:t xml:space="preserve">Boxes</w:t>
+      </w:r>
+      <w:r>
+        <w:t xml:space="preserve"> </w:t>
+      </w:r>
+      <w:r>
+        <w:t xml:space="preserve">5.</w:t>
+      </w:r>
+      <w:r>
+        <w:t xml:space="preserve"> </w:t>
+      </w:r>
+      <w:r>
+        <w:rPr>
+          <w:bCs/>
+          <w:b/>
+        </w:rPr>
+        <w:t xml:space="preserve">Defense</w:t>
+      </w:r>
+      <w:r>
+        <w:t xml:space="preserve"> </w:t>
+      </w:r>
+      <w:r>
+        <w:t xml:space="preserve">II (warded mail).</w:t>
+      </w:r>
+      <w:r>
+        <w:t xml:space="preserve"> </w:t>
+      </w:r>
+      <w:r>
+        <w:rPr>
+          <w:bCs/>
+          <w:b/>
+        </w:rPr>
+        <w:t xml:space="preserve">Powers</w:t>
+      </w:r>
+      <w:r>
+        <w:t xml:space="preserve"> </w:t>
+      </w:r>
+      <w:r>
+        <w:t xml:space="preserve">through his artifacts: a consecrated blade (Class III, one Class higher against spirits and monsters), Warding III, Mystic Sight II, warded mail (Defense II).</w:t>
+      </w:r>
+      <w:r>
+        <w:t xml:space="preserve"> </w:t>
+      </w:r>
+      <w:r>
+        <w:rPr>
+          <w:bCs/>
+          <w:b/>
+        </w:rPr>
+        <w:t xml:space="preserve">Skills</w:t>
+      </w:r>
+      <w:r>
+        <w:t xml:space="preserve"> </w:t>
+      </w:r>
+      <w:r>
+        <w:t xml:space="preserve">Occult 14, Melee 15, Leadership 13, Firearms 14.</w:t>
+      </w:r>
+      <w:r>
+        <w:t xml:space="preserve"> </w:t>
+      </w:r>
+      <w:r>
+        <w:rPr>
+          <w:bCs/>
+          <w:b/>
+        </w:rPr>
+        <w:t xml:space="preserve">The Order.</w:t>
+      </w:r>
+      <w:r>
+        <w:t xml:space="preserve"> </w:t>
+      </w:r>
+      <w:r>
+        <w:t xml:space="preserve">He brings his specialists: two or three ExLAW-grade operatives. Lose the artifacts and he’s a very good ex-Marine.</w:t>
       </w:r>
     </w:p>
     <w:p>
@@ -2830,13 +3887,13 @@
           <w:bCs/>
           <w:b/>
         </w:rPr>
-        <w:t xml:space="preserve">Sergei Grachyov.</w:t>
-      </w:r>
-      <w:r>
-        <w:t xml:space="preserve"> </w:t>
-      </w:r>
-      <w:r>
-        <w:t xml:space="preserve">Considered one of the strongest men on Earth, he serves the Foundation as troubleshooter and chief recovery expert for the empowered, traumatized and psychopathic escapees from its black labs. Wanted worldwide, he is considered a weapon of mass destruction by himself. He has been reported dead several times; it never sticks. He has fought the Golden Centurion and Vanguard to a standstill.</w:t>
+        <w:t xml:space="preserve">Lord Marrow (Altari Marrow).</w:t>
+      </w:r>
+      <w:r>
+        <w:t xml:space="preserve"> </w:t>
+      </w:r>
+      <w:r>
+        <w:t xml:space="preserve">A self-proclaimed magus with illusory and telepathic powers, who brings his victims’ fears to life. He can’t control minds, but he can terrify people into handing over money, jewels or secrets his weak mental scans can’t find. Strong minds resist him, so he researches his victims to find the perfect fear. He lives somewhere in Europe and works for the Morcain on special occasions; his reliance on horror-film images betrays a lack of imagination.</w:t>
       </w:r>
     </w:p>
     <w:p>
@@ -2845,93 +3902,1516 @@
       </w:pPr>
       <w:r>
         <w:rPr>
-          <w:bCs/>
-          <w:b/>
-        </w:rPr>
-        <w:t xml:space="preserve">Uathach (Ciara Byrne).</w:t>
-      </w:r>
-      <w:r>
-        <w:t xml:space="preserve"> </w:t>
-      </w:r>
-      <w:r>
-        <w:t xml:space="preserve">When Ciara Byrne recites a litany she found on her grandfather’s farm, she takes on the body and power of</w:t>
-      </w:r>
-      <w:r>
-        <w:t xml:space="preserve"> </w:t>
-      </w:r>
-      <w:r>
-        <w:rPr>
-          <w:bCs/>
-          <w:b/>
-        </w:rPr>
-        <w:t xml:space="preserve">Uathach</w:t>
-      </w:r>
-      <w:r>
-        <w:t xml:space="preserve">, a Celtic warrior goddess pushed to the edges of Irish myth, and shares her consciousness with the bloodthirsty spirit. Uathach usually avenges wrongs done to women around the world, but she has fought beside others against Autuarch in South America, against the Umkas, and against the minions of Shadow Earth.</w:t>
+          <w:iCs/>
+          <w:i/>
+        </w:rPr>
+        <w:t xml:space="preserve">Class III.</w:t>
+      </w:r>
+      <w:r>
+        <w:t xml:space="preserve"> </w:t>
+      </w:r>
+      <w:r>
+        <w:rPr>
+          <w:bCs/>
+          <w:b/>
+        </w:rPr>
+        <w:t xml:space="preserve">Attacks</w:t>
+      </w:r>
+      <w:r>
+        <w:t xml:space="preserve"> </w:t>
+      </w:r>
+      <w:r>
+        <w:t xml:space="preserve">Powers 15 (a living nightmare, Class II; Will resists).</w:t>
+      </w:r>
+      <w:r>
+        <w:t xml:space="preserve"> </w:t>
+      </w:r>
+      <w:r>
+        <w:rPr>
+          <w:bCs/>
+          <w:b/>
+        </w:rPr>
+        <w:t xml:space="preserve">Dodge</w:t>
+      </w:r>
+      <w:r>
+        <w:t xml:space="preserve"> </w:t>
+      </w:r>
+      <w:r>
+        <w:t xml:space="preserve">9.</w:t>
+      </w:r>
+      <w:r>
+        <w:t xml:space="preserve"> </w:t>
+      </w:r>
+      <w:r>
+        <w:rPr>
+          <w:bCs/>
+          <w:b/>
+        </w:rPr>
+        <w:t xml:space="preserve">Boxes</w:t>
+      </w:r>
+      <w:r>
+        <w:t xml:space="preserve"> </w:t>
+      </w:r>
+      <w:r>
+        <w:t xml:space="preserve">3.</w:t>
+      </w:r>
+      <w:r>
+        <w:t xml:space="preserve"> </w:t>
+      </w:r>
+      <w:r>
+        <w:rPr>
+          <w:bCs/>
+          <w:b/>
+        </w:rPr>
+        <w:t xml:space="preserve">Defense</w:t>
+      </w:r>
+      <w:r>
+        <w:t xml:space="preserve"> </w:t>
+      </w:r>
+      <w:r>
+        <w:t xml:space="preserve">none.</w:t>
+      </w:r>
+      <w:r>
+        <w:t xml:space="preserve"> </w:t>
+      </w:r>
+      <w:r>
+        <w:rPr>
+          <w:bCs/>
+          <w:b/>
+        </w:rPr>
+        <w:t xml:space="preserve">Powers</w:t>
+      </w:r>
+      <w:r>
+        <w:t xml:space="preserve"> </w:t>
+      </w:r>
+      <w:r>
+        <w:t xml:space="preserve">Illusion III (fears made real), Telepathy II (shallow scans).</w:t>
+      </w:r>
+      <w:r>
+        <w:t xml:space="preserve"> </w:t>
+      </w:r>
+      <w:r>
+        <w:rPr>
+          <w:bCs/>
+          <w:b/>
+        </w:rPr>
+        <w:t xml:space="preserve">Skills</w:t>
+      </w:r>
+      <w:r>
+        <w:t xml:space="preserve"> </w:t>
+      </w:r>
+      <w:r>
+        <w:t xml:space="preserve">Deception 15, Investigation 13, Persuasion 13, Read People 13.</w:t>
+      </w:r>
+      <w:r>
+        <w:t xml:space="preserve"> </w:t>
+      </w:r>
+      <w:r>
+        <w:rPr>
+          <w:bCs/>
+          <w:b/>
+        </w:rPr>
+        <w:t xml:space="preserve">Strong minds.</w:t>
+      </w:r>
+      <w:r>
+        <w:t xml:space="preserve"> </w:t>
+      </w:r>
+      <w:r>
+        <w:t xml:space="preserve">A character with Will 13 or more resists his illusions at +2. He studies his victims first: if he knows your fear, the nightmare is Class III.</w:t>
       </w:r>
     </w:p>
     <w:p>
       <w:pPr>
-        <w:pStyle w:val="BlockText"/>
-      </w:pPr>
-      <w:r>
-        <w:t xml:space="preserve">Come, Uathach,</w:t>
-      </w:r>
-      <w:r>
-        <w:t xml:space="preserve"> </w:t>
-      </w:r>
-      <w:r>
-        <w:t xml:space="preserve">walk with me in the clash,</w:t>
-      </w:r>
-      <w:r>
-        <w:t xml:space="preserve"> </w:t>
-      </w:r>
-      <w:r>
-        <w:t xml:space="preserve">stand with me in the storm,</w:t>
-      </w:r>
-      <w:r>
-        <w:t xml:space="preserve"> </w:t>
-      </w:r>
-      <w:r>
-        <w:t xml:space="preserve">lend me your hand of red flame,</w:t>
-      </w:r>
-      <w:r>
-        <w:t xml:space="preserve"> </w:t>
-      </w:r>
-      <w:r>
-        <w:t xml:space="preserve">your unbroken will of iron.</w:t>
-      </w:r>
-      <w:r>
-        <w:t xml:space="preserve"> </w:t>
-      </w:r>
-      <w:r>
-        <w:t xml:space="preserve">I kindle your name,</w:t>
-      </w:r>
-      <w:r>
-        <w:t xml:space="preserve"> </w:t>
-      </w:r>
-      <w:r>
-        <w:t xml:space="preserve">I breathe your power,</w:t>
-      </w:r>
-      <w:r>
-        <w:t xml:space="preserve"> </w:t>
-      </w:r>
-      <w:r>
-        <w:t xml:space="preserve">I bear your shadow,</w:t>
-      </w:r>
-      <w:r>
-        <w:t xml:space="preserve"> </w:t>
-      </w:r>
-      <w:r>
-        <w:t xml:space="preserve">and I rise.</w:t>
+        <w:pStyle w:val="BodyText"/>
+      </w:pPr>
+      <w:r>
+        <w:rPr>
+          <w:bCs/>
+          <w:b/>
+        </w:rPr>
+        <w:t xml:space="preserve">The Ice Reaper (Hyun Wang).</w:t>
+      </w:r>
+      <w:r>
+        <w:t xml:space="preserve"> </w:t>
+      </w:r>
+      <w:r>
+        <w:t xml:space="preserve">A South Korean gangster who found an artifact that bonded an</w:t>
+      </w:r>
+      <w:r>
+        <w:t xml:space="preserve"> </w:t>
+      </w:r>
+      <w:r>
+        <w:rPr>
+          <w:iCs/>
+          <w:i/>
+        </w:rPr>
+        <w:t xml:space="preserve">aleum sasin</w:t>
+      </w:r>
+      <w:r>
+        <w:t xml:space="preserve">, an Ice Reaper, to him. He can become the bloodthirsty spirit at will, and used it to become the</w:t>
+      </w:r>
+      <w:r>
+        <w:t xml:space="preserve"> </w:t>
+      </w:r>
+      <w:r>
+        <w:rPr>
+          <w:iCs/>
+          <w:i/>
+        </w:rPr>
+        <w:t xml:space="preserve">Sangsanim</w:t>
+      </w:r>
+      <w:r>
+        <w:t xml:space="preserve">, boss of his country’s underworld. He sits on the 12.</w:t>
       </w:r>
     </w:p>
     <w:p>
       <w:pPr>
+        <w:pStyle w:val="BodyText"/>
+      </w:pPr>
+      <w:r>
+        <w:rPr>
+          <w:iCs/>
+          <w:i/>
+        </w:rPr>
+        <w:t xml:space="preserve">Class IV.</w:t>
+      </w:r>
+      <w:r>
+        <w:t xml:space="preserve"> </w:t>
+      </w:r>
+      <w:r>
+        <w:rPr>
+          <w:bCs/>
+          <w:b/>
+        </w:rPr>
+        <w:t xml:space="preserve">Attacks</w:t>
+      </w:r>
+      <w:r>
+        <w:t xml:space="preserve"> </w:t>
+      </w:r>
+      <w:r>
+        <w:t xml:space="preserve">Melee 16 (the Reaper’s scythe of ice, Class IV); Powers 14 (killing cold, Blast III).</w:t>
+      </w:r>
+      <w:r>
+        <w:t xml:space="preserve"> </w:t>
+      </w:r>
+      <w:r>
+        <w:rPr>
+          <w:bCs/>
+          <w:b/>
+        </w:rPr>
+        <w:t xml:space="preserve">Dodge</w:t>
+      </w:r>
+      <w:r>
+        <w:t xml:space="preserve"> </w:t>
+      </w:r>
+      <w:r>
+        <w:t xml:space="preserve">11.</w:t>
+      </w:r>
+      <w:r>
+        <w:t xml:space="preserve"> </w:t>
+      </w:r>
+      <w:r>
+        <w:rPr>
+          <w:bCs/>
+          <w:b/>
+        </w:rPr>
+        <w:t xml:space="preserve">Boxes</w:t>
+      </w:r>
+      <w:r>
+        <w:t xml:space="preserve"> </w:t>
+      </w:r>
+      <w:r>
+        <w:t xml:space="preserve">5.</w:t>
+      </w:r>
+      <w:r>
+        <w:t xml:space="preserve"> </w:t>
+      </w:r>
+      <w:r>
+        <w:rPr>
+          <w:bCs/>
+          <w:b/>
+        </w:rPr>
+        <w:t xml:space="preserve">Defense</w:t>
+      </w:r>
+      <w:r>
+        <w:t xml:space="preserve"> </w:t>
+      </w:r>
+      <w:r>
+        <w:t xml:space="preserve">III (the Reaper’s form).</w:t>
+      </w:r>
+      <w:r>
+        <w:t xml:space="preserve"> </w:t>
+      </w:r>
+      <w:r>
+        <w:rPr>
+          <w:bCs/>
+          <w:b/>
+        </w:rPr>
+        <w:t xml:space="preserve">Powers</w:t>
+      </w:r>
+      <w:r>
+        <w:t xml:space="preserve"> </w:t>
+      </w:r>
+      <w:r>
+        <w:t xml:space="preserve">Transformation (into the aleum sasin, at will): Natural Weapons IV, Toughness III, Elemental Control (ice) III, Phasing II.</w:t>
+      </w:r>
+      <w:r>
+        <w:t xml:space="preserve"> </w:t>
+      </w:r>
+      <w:r>
+        <w:rPr>
+          <w:bCs/>
+          <w:b/>
+        </w:rPr>
+        <w:t xml:space="preserve">Skills</w:t>
+      </w:r>
+      <w:r>
+        <w:t xml:space="preserve"> </w:t>
+      </w:r>
+      <w:r>
+        <w:t xml:space="preserve">Leadership 14, Streetwise 15, Persuasion 14 (threats), Melee 16.</w:t>
+      </w:r>
+      <w:r>
+        <w:t xml:space="preserve"> </w:t>
+      </w:r>
+      <w:r>
+        <w:rPr>
+          <w:bCs/>
+          <w:b/>
+        </w:rPr>
+        <w:t xml:space="preserve">Bloodthirsty spirit.</w:t>
+      </w:r>
+      <w:r>
+        <w:t xml:space="preserve"> </w:t>
+      </w:r>
+      <w:r>
+        <w:t xml:space="preserve">In the Reaper’s form he must take a life before the scene ends, or mark Strain. One of the 12: harming him draws the Morcain.</w:t>
+      </w:r>
+    </w:p>
+    <w:p>
+      <w:pPr>
+        <w:pStyle w:val="BodyText"/>
+      </w:pPr>
+      <w:r>
+        <w:rPr>
+          <w:bCs/>
+          <w:b/>
+        </w:rPr>
+        <w:t xml:space="preserve">Helios (David Carlysle Jones), 44.</w:t>
+      </w:r>
+      <w:r>
+        <w:t xml:space="preserve"> </w:t>
+      </w:r>
+      <w:r>
+        <w:t xml:space="preserve">A former Army major recruited into DIRE and given a heavily modified Ambrosia. The transformation was agonizing, and made him one of the most powerful Operants alive: he absorbs and redirects sunlight as energy blasts or flight, and is nearly invulnerable and remarkably strong. His weakness: eight hours without sunlight (the moon and stars don’t count) leave him near human.</w:t>
+      </w:r>
+    </w:p>
+    <w:p>
+      <w:pPr>
+        <w:pStyle w:val="BodyText"/>
+      </w:pPr>
+      <w:r>
+        <w:rPr>
+          <w:iCs/>
+          <w:i/>
+        </w:rPr>
+        <w:t xml:space="preserve">Class V.</w:t>
+      </w:r>
+      <w:r>
+        <w:t xml:space="preserve"> </w:t>
+      </w:r>
+      <w:r>
+        <w:rPr>
+          <w:bCs/>
+          <w:b/>
+        </w:rPr>
+        <w:t xml:space="preserve">Attacks</w:t>
+      </w:r>
+      <w:r>
+        <w:t xml:space="preserve"> </w:t>
+      </w:r>
+      <w:r>
+        <w:t xml:space="preserve">Powers 16 (solar blast, Class V); Brawling 14 (Strength III).</w:t>
+      </w:r>
+      <w:r>
+        <w:t xml:space="preserve"> </w:t>
+      </w:r>
+      <w:r>
+        <w:rPr>
+          <w:bCs/>
+          <w:b/>
+        </w:rPr>
+        <w:t xml:space="preserve">Dodge</w:t>
+      </w:r>
+      <w:r>
+        <w:t xml:space="preserve"> </w:t>
+      </w:r>
+      <w:r>
+        <w:t xml:space="preserve">11.</w:t>
+      </w:r>
+      <w:r>
+        <w:t xml:space="preserve"> </w:t>
+      </w:r>
+      <w:r>
+        <w:rPr>
+          <w:bCs/>
+          <w:b/>
+        </w:rPr>
+        <w:t xml:space="preserve">Boxes</w:t>
+      </w:r>
+      <w:r>
+        <w:t xml:space="preserve"> </w:t>
+      </w:r>
+      <w:r>
+        <w:t xml:space="preserve">6.</w:t>
+      </w:r>
+      <w:r>
+        <w:t xml:space="preserve"> </w:t>
+      </w:r>
+      <w:r>
+        <w:rPr>
+          <w:bCs/>
+          <w:b/>
+        </w:rPr>
+        <w:t xml:space="preserve">Defense</w:t>
+      </w:r>
+      <w:r>
+        <w:t xml:space="preserve"> </w:t>
+      </w:r>
+      <w:r>
+        <w:t xml:space="preserve">IV (Toughness).</w:t>
+      </w:r>
+      <w:r>
+        <w:t xml:space="preserve"> </w:t>
+      </w:r>
+      <w:r>
+        <w:rPr>
+          <w:bCs/>
+          <w:b/>
+        </w:rPr>
+        <w:t xml:space="preserve">Powers</w:t>
+      </w:r>
+      <w:r>
+        <w:t xml:space="preserve"> </w:t>
+      </w:r>
+      <w:r>
+        <w:t xml:space="preserve">Energy Absorption (sunlight) V, Blast V, Flight IV, Toughness IV, Strength III.</w:t>
+      </w:r>
+      <w:r>
+        <w:t xml:space="preserve"> </w:t>
+      </w:r>
+      <w:r>
+        <w:rPr>
+          <w:bCs/>
+          <w:b/>
+        </w:rPr>
+        <w:t xml:space="preserve">Skills</w:t>
+      </w:r>
+      <w:r>
+        <w:t xml:space="preserve"> </w:t>
+      </w:r>
+      <w:r>
+        <w:t xml:space="preserve">Firearms 14, Leadership 14, Piloting 13, Athletics 13.</w:t>
+      </w:r>
+      <w:r>
+        <w:t xml:space="preserve"> </w:t>
+      </w:r>
+      <w:r>
+        <w:rPr>
+          <w:bCs/>
+          <w:b/>
+        </w:rPr>
+        <w:t xml:space="preserve">Sunlight.</w:t>
+      </w:r>
+      <w:r>
+        <w:t xml:space="preserve"> </w:t>
+      </w:r>
+      <w:r>
+        <w:t xml:space="preserve">Eight hours without sunlight (not moonlight or starlight) and every power drops to Class I until he’s back in the sun.</w:t>
+      </w:r>
+    </w:p>
+    <w:p>
+      <w:pPr>
+        <w:pStyle w:val="BodyText"/>
+      </w:pPr>
+      <w:r>
+        <w:rPr>
+          <w:bCs/>
+          <w:b/>
+        </w:rPr>
+        <w:t xml:space="preserve">Zephyr (Dr. Alemayehu Okafor).</w:t>
+      </w:r>
+      <w:r>
+        <w:t xml:space="preserve"> </w:t>
+      </w:r>
+      <w:r>
+        <w:t xml:space="preserve">A famed Ethiopian archaeologist who pursues cryptozoological artifacts with militant zeal. A native Operant with heightened strength and resilience and the power to control the air, he is an avowed environmentalist, wanted in several countries for alleged attacks on industrial and mining concerns in Africa.</w:t>
+      </w:r>
+    </w:p>
+    <w:p>
+      <w:pPr>
+        <w:pStyle w:val="BodyText"/>
+      </w:pPr>
+      <w:r>
+        <w:rPr>
+          <w:iCs/>
+          <w:i/>
+        </w:rPr>
+        <w:t xml:space="preserve">Class III.</w:t>
+      </w:r>
+      <w:r>
+        <w:t xml:space="preserve"> </w:t>
+      </w:r>
+      <w:r>
+        <w:rPr>
+          <w:bCs/>
+          <w:b/>
+        </w:rPr>
+        <w:t xml:space="preserve">Attacks</w:t>
+      </w:r>
+      <w:r>
+        <w:t xml:space="preserve"> </w:t>
+      </w:r>
+      <w:r>
+        <w:t xml:space="preserve">Powers 15 (a hammer of wind, Class III); Brawling 13 (Strength II).</w:t>
+      </w:r>
+      <w:r>
+        <w:t xml:space="preserve"> </w:t>
+      </w:r>
+      <w:r>
+        <w:rPr>
+          <w:bCs/>
+          <w:b/>
+        </w:rPr>
+        <w:t xml:space="preserve">Dodge</w:t>
+      </w:r>
+      <w:r>
+        <w:t xml:space="preserve"> </w:t>
+      </w:r>
+      <w:r>
+        <w:t xml:space="preserve">12.</w:t>
+      </w:r>
+      <w:r>
+        <w:t xml:space="preserve"> </w:t>
+      </w:r>
+      <w:r>
+        <w:rPr>
+          <w:bCs/>
+          <w:b/>
+        </w:rPr>
+        <w:t xml:space="preserve">Boxes</w:t>
+      </w:r>
+      <w:r>
+        <w:t xml:space="preserve"> </w:t>
+      </w:r>
+      <w:r>
+        <w:t xml:space="preserve">4.</w:t>
+      </w:r>
+      <w:r>
+        <w:t xml:space="preserve"> </w:t>
+      </w:r>
+      <w:r>
+        <w:rPr>
+          <w:bCs/>
+          <w:b/>
+        </w:rPr>
+        <w:t xml:space="preserve">Defense</w:t>
+      </w:r>
+      <w:r>
+        <w:t xml:space="preserve"> </w:t>
+      </w:r>
+      <w:r>
+        <w:t xml:space="preserve">II (Toughness).</w:t>
+      </w:r>
+      <w:r>
+        <w:t xml:space="preserve"> </w:t>
+      </w:r>
+      <w:r>
+        <w:rPr>
+          <w:bCs/>
+          <w:b/>
+        </w:rPr>
+        <w:t xml:space="preserve">Powers</w:t>
+      </w:r>
+      <w:r>
+        <w:t xml:space="preserve"> </w:t>
+      </w:r>
+      <w:r>
+        <w:t xml:space="preserve">Elemental Control (air) III, Flight II, Strength II, Toughness II.</w:t>
+      </w:r>
+      <w:r>
+        <w:t xml:space="preserve"> </w:t>
+      </w:r>
+      <w:r>
+        <w:rPr>
+          <w:bCs/>
+          <w:b/>
+        </w:rPr>
+        <w:t xml:space="preserve">Skills</w:t>
+      </w:r>
+      <w:r>
+        <w:t xml:space="preserve"> </w:t>
+      </w:r>
+      <w:r>
+        <w:t xml:space="preserve">Science 15 (archaeology), Occult 13, Athletics 13, Persuasion 12.</w:t>
+      </w:r>
+      <w:r>
+        <w:t xml:space="preserve"> </w:t>
+      </w:r>
+      <w:r>
+        <w:rPr>
+          <w:bCs/>
+          <w:b/>
+        </w:rPr>
+        <w:t xml:space="preserve">Eco-saboteur.</w:t>
+      </w:r>
+      <w:r>
+        <w:t xml:space="preserve"> </w:t>
+      </w:r>
+      <w:r>
+        <w:t xml:space="preserve">Wanted in several countries. He spares workers and strikes machines; give him a polluter and he may become an ally.</w:t>
+      </w:r>
+    </w:p>
+    <w:p>
+      <w:pPr>
+        <w:pStyle w:val="BodyText"/>
+      </w:pPr>
+      <w:r>
+        <w:rPr>
+          <w:bCs/>
+          <w:b/>
+        </w:rPr>
+        <w:t xml:space="preserve">Evelyn Dark, 25.</w:t>
+      </w:r>
+      <w:r>
+        <w:t xml:space="preserve"> </w:t>
+      </w:r>
+      <w:r>
+        <w:t xml:space="preserve">Born in Avalon to a line of witches descended from Hecate and Freya, with a rare gift for manipulating energy and matter. A seer foretold she would bring Avalon’s doom, and at thirteen she fled to Earth in defiance of the Accords. She gathered homeless children into a ring of thieves and con artists, the</w:t>
+      </w:r>
+      <w:r>
+        <w:t xml:space="preserve"> </w:t>
+      </w:r>
+      <w:r>
+        <w:rPr>
+          <w:bCs/>
+          <w:b/>
+        </w:rPr>
+        <w:t xml:space="preserve">Dark Ones</w:t>
+      </w:r>
+      <w:r>
+        <w:t xml:space="preserve">, until the Foundation caught her two years later. Its experiments heightened and destabilized her powers; one destroyed the lab and the town around it, and she was the only survivor. In the decade since, she has used her powers sparingly, helping where she can and hiding from Earth’s most powerful magic users.</w:t>
+      </w:r>
+    </w:p>
+    <w:p>
+      <w:pPr>
+        <w:pStyle w:val="BodyText"/>
+      </w:pPr>
+      <w:r>
+        <w:rPr>
+          <w:iCs/>
+          <w:i/>
+        </w:rPr>
+        <w:t xml:space="preserve">Class V.</w:t>
+      </w:r>
+      <w:r>
+        <w:t xml:space="preserve"> </w:t>
+      </w:r>
+      <w:r>
+        <w:rPr>
+          <w:bCs/>
+          <w:b/>
+        </w:rPr>
+        <w:t xml:space="preserve">Attacks</w:t>
+      </w:r>
+      <w:r>
+        <w:t xml:space="preserve"> </w:t>
+      </w:r>
+      <w:r>
+        <w:t xml:space="preserve">Powers 16 (raw energy, Class V).</w:t>
+      </w:r>
+      <w:r>
+        <w:t xml:space="preserve"> </w:t>
+      </w:r>
+      <w:r>
+        <w:rPr>
+          <w:bCs/>
+          <w:b/>
+        </w:rPr>
+        <w:t xml:space="preserve">Dodge</w:t>
+      </w:r>
+      <w:r>
+        <w:t xml:space="preserve"> </w:t>
+      </w:r>
+      <w:r>
+        <w:t xml:space="preserve">12.</w:t>
+      </w:r>
+      <w:r>
+        <w:t xml:space="preserve"> </w:t>
+      </w:r>
+      <w:r>
+        <w:rPr>
+          <w:bCs/>
+          <w:b/>
+        </w:rPr>
+        <w:t xml:space="preserve">Boxes</w:t>
+      </w:r>
+      <w:r>
+        <w:t xml:space="preserve"> </w:t>
+      </w:r>
+      <w:r>
+        <w:t xml:space="preserve">4.</w:t>
+      </w:r>
+      <w:r>
+        <w:t xml:space="preserve"> </w:t>
+      </w:r>
+      <w:r>
+        <w:rPr>
+          <w:bCs/>
+          <w:b/>
+        </w:rPr>
+        <w:t xml:space="preserve">Defense</w:t>
+      </w:r>
+      <w:r>
+        <w:t xml:space="preserve"> </w:t>
+      </w:r>
+      <w:r>
+        <w:t xml:space="preserve">III (a force field).</w:t>
+      </w:r>
+      <w:r>
+        <w:t xml:space="preserve"> </w:t>
+      </w:r>
+      <w:r>
+        <w:rPr>
+          <w:bCs/>
+          <w:b/>
+        </w:rPr>
+        <w:t xml:space="preserve">Powers</w:t>
+      </w:r>
+      <w:r>
+        <w:t xml:space="preserve"> </w:t>
+      </w:r>
+      <w:r>
+        <w:t xml:space="preserve">Cantrips IV, Blast V, Telekinesis IV, Force Field III, all of it heightened and destabilized by the Foundation.</w:t>
+      </w:r>
+      <w:r>
+        <w:t xml:space="preserve"> </w:t>
+      </w:r>
+      <w:r>
+        <w:rPr>
+          <w:bCs/>
+          <w:b/>
+        </w:rPr>
+        <w:t xml:space="preserve">Skills</w:t>
+      </w:r>
+      <w:r>
+        <w:t xml:space="preserve"> </w:t>
+      </w:r>
+      <w:r>
+        <w:t xml:space="preserve">Deception 14, Stealth 14, Streetwise 13, Occult 14.</w:t>
+      </w:r>
+      <w:r>
+        <w:t xml:space="preserve"> </w:t>
+      </w:r>
+      <w:r>
+        <w:rPr>
+          <w:bCs/>
+          <w:b/>
+        </w:rPr>
+        <w:t xml:space="preserve">Unstable.</w:t>
+      </w:r>
+      <w:r>
+        <w:t xml:space="preserve"> </w:t>
+      </w:r>
+      <w:r>
+        <w:t xml:space="preserve">On a natural 17 or 18 with Powers, the power hits everyone nearby. Using a power above Class III draws Avalon’s hunters (Scrutiny).</w:t>
+      </w:r>
+    </w:p>
+    <w:p>
+      <w:pPr>
+        <w:pStyle w:val="BodyText"/>
+      </w:pPr>
+      <w:r>
+        <w:rPr>
+          <w:bCs/>
+          <w:b/>
+        </w:rPr>
+        <w:t xml:space="preserve">Milon Dubinsky, about 650.</w:t>
+      </w:r>
+      <w:r>
+        <w:t xml:space="preserve"> </w:t>
+      </w:r>
+      <w:r>
+        <w:t xml:space="preserve">Once a king in what is now Romania, who killed every man in a conquered village so he could marry the chieftain’s wife. She poisoned him before the wedding, and when he begged for a cure, cursed him to undying life as a wolfman, unable to return to human form. He found he could share part of his curse with the descendants of his tribe (supernaturally tough and able to change back, but mortal), and over six centuries has built a small army of werewolves to do his bidding.</w:t>
+      </w:r>
+    </w:p>
+    <w:p>
+      <w:pPr>
+        <w:pStyle w:val="BodyText"/>
+      </w:pPr>
+      <w:r>
+        <w:rPr>
+          <w:iCs/>
+          <w:i/>
+        </w:rPr>
+        <w:t xml:space="preserve">Class IV.</w:t>
+      </w:r>
+      <w:r>
+        <w:t xml:space="preserve"> </w:t>
+      </w:r>
+      <w:r>
+        <w:rPr>
+          <w:bCs/>
+          <w:b/>
+        </w:rPr>
+        <w:t xml:space="preserve">Attacks</w:t>
+      </w:r>
+      <w:r>
+        <w:t xml:space="preserve"> </w:t>
+      </w:r>
+      <w:r>
+        <w:t xml:space="preserve">Brawling 17 (claws and fangs, Class IV).</w:t>
+      </w:r>
+      <w:r>
+        <w:t xml:space="preserve"> </w:t>
+      </w:r>
+      <w:r>
+        <w:rPr>
+          <w:bCs/>
+          <w:b/>
+        </w:rPr>
+        <w:t xml:space="preserve">Dodge</w:t>
+      </w:r>
+      <w:r>
+        <w:t xml:space="preserve"> </w:t>
+      </w:r>
+      <w:r>
+        <w:t xml:space="preserve">12.</w:t>
+      </w:r>
+      <w:r>
+        <w:t xml:space="preserve"> </w:t>
+      </w:r>
+      <w:r>
+        <w:rPr>
+          <w:bCs/>
+          <w:b/>
+        </w:rPr>
+        <w:t xml:space="preserve">Boxes</w:t>
+      </w:r>
+      <w:r>
+        <w:t xml:space="preserve"> </w:t>
+      </w:r>
+      <w:r>
+        <w:t xml:space="preserve">6.</w:t>
+      </w:r>
+      <w:r>
+        <w:t xml:space="preserve"> </w:t>
+      </w:r>
+      <w:r>
+        <w:rPr>
+          <w:bCs/>
+          <w:b/>
+        </w:rPr>
+        <w:t xml:space="preserve">Defense</w:t>
+      </w:r>
+      <w:r>
+        <w:t xml:space="preserve"> </w:t>
+      </w:r>
+      <w:r>
+        <w:t xml:space="preserve">III (the curse).</w:t>
+      </w:r>
+      <w:r>
+        <w:t xml:space="preserve"> </w:t>
+      </w:r>
+      <w:r>
+        <w:rPr>
+          <w:bCs/>
+          <w:b/>
+        </w:rPr>
+        <w:t xml:space="preserve">Powers</w:t>
+      </w:r>
+      <w:r>
+        <w:t xml:space="preserve"> </w:t>
+      </w:r>
+      <w:r>
+        <w:t xml:space="preserve">Natural Weapons IV, Strength IV, Toughness III, Regeneration IV, Immortality IV (Mythic), Enhanced Senses III.</w:t>
+      </w:r>
+      <w:r>
+        <w:t xml:space="preserve"> </w:t>
+      </w:r>
+      <w:r>
+        <w:rPr>
+          <w:bCs/>
+          <w:b/>
+        </w:rPr>
+        <w:t xml:space="preserve">Skills</w:t>
+      </w:r>
+      <w:r>
+        <w:t xml:space="preserve"> </w:t>
+      </w:r>
+      <w:r>
+        <w:t xml:space="preserve">Brawling 17, Leadership 14, Stealth 13, Athletics 14.</w:t>
+      </w:r>
+      <w:r>
+        <w:t xml:space="preserve"> </w:t>
+      </w:r>
+      <w:r>
+        <w:rPr>
+          <w:bCs/>
+          <w:b/>
+        </w:rPr>
+        <w:t xml:space="preserve">The wolf-king.</w:t>
+      </w:r>
+      <w:r>
+        <w:t xml:space="preserve"> </w:t>
+      </w:r>
+      <w:r>
+        <w:t xml:space="preserve">Silver ignores his Defense and stops his Regeneration. He never fights without three Dubinsky werewolves, and can’t take human form.</w:t>
+      </w:r>
+    </w:p>
+    <w:p>
+      <w:pPr>
+        <w:pStyle w:val="BodyText"/>
+      </w:pPr>
+      <w:r>
+        <w:rPr>
+          <w:bCs/>
+          <w:b/>
+        </w:rPr>
+        <w:t xml:space="preserve">Nikola Tesla, 169.</w:t>
+      </w:r>
+      <w:r>
+        <w:t xml:space="preserve"> </w:t>
+      </w:r>
+      <w:r>
+        <w:t xml:space="preserve">Rarely on our Earth now. He prefers his pocket dimension, 1884 Ivry-sur-Seine, where his laboratory has doors to many other dimensions, Shadow Earth among them. He experiments with inventions to enhance or modify Operant abilities, including the metatropic manipulations called magic. He has devised a way to trap Richard Kennedy, and hasn’t used it: he doesn’t want to interrupt the man’s good works.</w:t>
+      </w:r>
+    </w:p>
+    <w:p>
+      <w:pPr>
+        <w:pStyle w:val="BodyText"/>
+      </w:pPr>
+      <w:r>
+        <w:rPr>
+          <w:iCs/>
+          <w:i/>
+        </w:rPr>
+        <w:t xml:space="preserve">Class VI.</w:t>
+      </w:r>
+      <w:r>
+        <w:t xml:space="preserve"> </w:t>
+      </w:r>
+      <w:r>
+        <w:rPr>
+          <w:bCs/>
+          <w:b/>
+        </w:rPr>
+        <w:t xml:space="preserve">Attacks</w:t>
+      </w:r>
+      <w:r>
+        <w:t xml:space="preserve"> </w:t>
+      </w:r>
+      <w:r>
+        <w:t xml:space="preserve">Powers 15 (a lightning projector, Class IV).</w:t>
+      </w:r>
+      <w:r>
+        <w:t xml:space="preserve"> </w:t>
+      </w:r>
+      <w:r>
+        <w:rPr>
+          <w:bCs/>
+          <w:b/>
+        </w:rPr>
+        <w:t xml:space="preserve">Dodge</w:t>
+      </w:r>
+      <w:r>
+        <w:t xml:space="preserve"> </w:t>
+      </w:r>
+      <w:r>
+        <w:t xml:space="preserve">9.</w:t>
+      </w:r>
+      <w:r>
+        <w:t xml:space="preserve"> </w:t>
+      </w:r>
+      <w:r>
+        <w:rPr>
+          <w:bCs/>
+          <w:b/>
+        </w:rPr>
+        <w:t xml:space="preserve">Boxes</w:t>
+      </w:r>
+      <w:r>
+        <w:t xml:space="preserve"> </w:t>
+      </w:r>
+      <w:r>
+        <w:t xml:space="preserve">3.</w:t>
+      </w:r>
+      <w:r>
+        <w:t xml:space="preserve"> </w:t>
+      </w:r>
+      <w:r>
+        <w:rPr>
+          <w:bCs/>
+          <w:b/>
+        </w:rPr>
+        <w:t xml:space="preserve">Defense</w:t>
+      </w:r>
+      <w:r>
+        <w:t xml:space="preserve"> </w:t>
+      </w:r>
+      <w:r>
+        <w:t xml:space="preserve">IV (a personal field).</w:t>
+      </w:r>
+      <w:r>
+        <w:t xml:space="preserve"> </w:t>
+      </w:r>
+      <w:r>
+        <w:rPr>
+          <w:bCs/>
+          <w:b/>
+        </w:rPr>
+        <w:t xml:space="preserve">Powers</w:t>
+      </w:r>
+      <w:r>
+        <w:t xml:space="preserve"> </w:t>
+      </w:r>
+      <w:r>
+        <w:t xml:space="preserve">Super Intellect VI, Gadgeteering VI (doors between worlds), and whatever devices he brings: a personal field (Force Field IV), a lightning projector (Blast IV).</w:t>
+      </w:r>
+      <w:r>
+        <w:t xml:space="preserve"> </w:t>
+      </w:r>
+      <w:r>
+        <w:rPr>
+          <w:bCs/>
+          <w:b/>
+        </w:rPr>
+        <w:t xml:space="preserve">Skills</w:t>
+      </w:r>
+      <w:r>
+        <w:t xml:space="preserve"> </w:t>
+      </w:r>
+      <w:r>
+        <w:t xml:space="preserve">Science 18, Engineering 18, Occult 15, Persuasion 13.</w:t>
+      </w:r>
+      <w:r>
+        <w:t xml:space="preserve"> </w:t>
+      </w:r>
+      <w:r>
+        <w:rPr>
+          <w:bCs/>
+          <w:b/>
+        </w:rPr>
+        <w:t xml:space="preserve">Not really here.</w:t>
+      </w:r>
+      <w:r>
+        <w:t xml:space="preserve"> </w:t>
+      </w:r>
+      <w:r>
+        <w:t xml:space="preserve">He arrives and leaves through a door from 1884 Ivry-sur-Seine. He has a way to trap the Atomic Man, and won’t use it.</w:t>
+      </w:r>
+    </w:p>
+    <w:p>
+      <w:pPr>
+        <w:pStyle w:val="BodyText"/>
+      </w:pPr>
+      <w:r>
+        <w:rPr>
+          <w:bCs/>
+          <w:b/>
+        </w:rPr>
+        <w:t xml:space="preserve">The Atomic Man (Dr. Richard Kennedy), about 100.</w:t>
+      </w:r>
+      <w:r>
+        <w:t xml:space="preserve"> </w:t>
+      </w:r>
+      <w:r>
+        <w:t xml:space="preserve">A nuclear scientist and cousin of the political dynasty, irradiated in 1959 when he pushed his colleagues to safety from a runaway reactor. As he lay dying, an interdimensional entity offered to bond with him so he could continue his work and protect his world. He agreed, and was healed: he controls the strong and weak nuclear forces around him, and his mind holds the entity’s intellect as well as his own. Strength, speed, invulnerability, energy blasts, flight. He doesn’t seem to age, though in 2024 he found a grey hair. He supports democratic causes worldwide, protects civilians in war, and has destroyed whole arsenals to free nations from oppression. The US, China and Russia once built a weapon together to kill him; it failed. Only Sergei Grachyov has stood against him, in the 2007 battle that destroyed the Washington Monument. Grachyov’s rumored cancers are blamed on Kennedy.</w:t>
+      </w:r>
+    </w:p>
+    <w:p>
+      <w:pPr>
+        <w:pStyle w:val="BodyText"/>
+      </w:pPr>
+      <w:r>
+        <w:rPr>
+          <w:iCs/>
+          <w:i/>
+        </w:rPr>
+        <w:t xml:space="preserve">Class VI.</w:t>
+      </w:r>
+      <w:r>
+        <w:t xml:space="preserve"> </w:t>
+      </w:r>
+      <w:r>
+        <w:rPr>
+          <w:bCs/>
+          <w:b/>
+        </w:rPr>
+        <w:t xml:space="preserve">Attacks</w:t>
+      </w:r>
+      <w:r>
+        <w:t xml:space="preserve"> </w:t>
+      </w:r>
+      <w:r>
+        <w:t xml:space="preserve">Powers 17 (nuclear force, Class VI); Brawling 16 (Strength VI).</w:t>
+      </w:r>
+      <w:r>
+        <w:t xml:space="preserve"> </w:t>
+      </w:r>
+      <w:r>
+        <w:rPr>
+          <w:bCs/>
+          <w:b/>
+        </w:rPr>
+        <w:t xml:space="preserve">Dodge</w:t>
+      </w:r>
+      <w:r>
+        <w:t xml:space="preserve"> </w:t>
+      </w:r>
+      <w:r>
+        <w:t xml:space="preserve">13 (a second defense each round).</w:t>
+      </w:r>
+      <w:r>
+        <w:t xml:space="preserve"> </w:t>
+      </w:r>
+      <w:r>
+        <w:rPr>
+          <w:bCs/>
+          <w:b/>
+        </w:rPr>
+        <w:t xml:space="preserve">Boxes</w:t>
+      </w:r>
+      <w:r>
+        <w:t xml:space="preserve"> </w:t>
+      </w:r>
+      <w:r>
+        <w:t xml:space="preserve">8.</w:t>
+      </w:r>
+      <w:r>
+        <w:t xml:space="preserve"> </w:t>
+      </w:r>
+      <w:r>
+        <w:rPr>
+          <w:bCs/>
+          <w:b/>
+        </w:rPr>
+        <w:t xml:space="preserve">Defense</w:t>
+      </w:r>
+      <w:r>
+        <w:t xml:space="preserve"> </w:t>
+      </w:r>
+      <w:r>
+        <w:t xml:space="preserve">VI (Toughness).</w:t>
+      </w:r>
+      <w:r>
+        <w:t xml:space="preserve"> </w:t>
+      </w:r>
+      <w:r>
+        <w:rPr>
+          <w:bCs/>
+          <w:b/>
+        </w:rPr>
+        <w:t xml:space="preserve">Powers</w:t>
+      </w:r>
+      <w:r>
+        <w:t xml:space="preserve"> </w:t>
+      </w:r>
+      <w:r>
+        <w:t xml:space="preserve">Strength VI, Toughness VI, Blast VI, Flight VI, Speed IV, Super Intellect V (the entity’s mind beside his own).</w:t>
+      </w:r>
+      <w:r>
+        <w:t xml:space="preserve"> </w:t>
+      </w:r>
+      <w:r>
+        <w:rPr>
+          <w:bCs/>
+          <w:b/>
+        </w:rPr>
+        <w:t xml:space="preserve">Skills</w:t>
+      </w:r>
+      <w:r>
+        <w:t xml:space="preserve"> </w:t>
+      </w:r>
+      <w:r>
+        <w:t xml:space="preserve">Science 18, Leadership 15, Persuasion 14, Read People 14.</w:t>
+      </w:r>
+      <w:r>
+        <w:t xml:space="preserve"> </w:t>
+      </w:r>
+      <w:r>
+        <w:rPr>
+          <w:bCs/>
+          <w:b/>
+        </w:rPr>
+        <w:t xml:space="preserve">Protector.</w:t>
+      </w:r>
+      <w:r>
+        <w:t xml:space="preserve"> </w:t>
+      </w:r>
+      <w:r>
+        <w:t xml:space="preserve">He won’t risk a civilian, ever: put one in the line of fire and he stops. Only Grachyov has fought him to a draw.</w:t>
+      </w:r>
+    </w:p>
+    <w:p>
+      <w:pPr>
+        <w:pStyle w:val="BodyText"/>
+      </w:pPr>
+      <w:r>
+        <w:rPr>
+          <w:bCs/>
+          <w:b/>
+        </w:rPr>
+        <w:t xml:space="preserve">Sergei Grachyov.</w:t>
+      </w:r>
+      <w:r>
+        <w:t xml:space="preserve"> </w:t>
+      </w:r>
+      <w:r>
+        <w:t xml:space="preserve">Considered one of the strongest men on Earth, he serves the Foundation as troubleshooter and chief recovery expert for the empowered, traumatized and psychopathic escapees from its black labs. Wanted worldwide, he is considered a weapon of mass destruction by himself. He has been reported dead several times; it never sticks. He has fought the Golden Centurion and Vanguard to a standstill.</w:t>
+      </w:r>
+    </w:p>
+    <w:p>
+      <w:pPr>
+        <w:pStyle w:val="BodyText"/>
+      </w:pPr>
+      <w:r>
+        <w:rPr>
+          <w:iCs/>
+          <w:i/>
+        </w:rPr>
+        <w:t xml:space="preserve">Class V.</w:t>
+      </w:r>
+      <w:r>
+        <w:t xml:space="preserve"> </w:t>
+      </w:r>
+      <w:r>
+        <w:rPr>
+          <w:bCs/>
+          <w:b/>
+        </w:rPr>
+        <w:t xml:space="preserve">Attacks</w:t>
+      </w:r>
+      <w:r>
+        <w:t xml:space="preserve"> </w:t>
+      </w:r>
+      <w:r>
+        <w:t xml:space="preserve">Brawling 17 (Strength V).</w:t>
+      </w:r>
+      <w:r>
+        <w:t xml:space="preserve"> </w:t>
+      </w:r>
+      <w:r>
+        <w:rPr>
+          <w:bCs/>
+          <w:b/>
+        </w:rPr>
+        <w:t xml:space="preserve">Dodge</w:t>
+      </w:r>
+      <w:r>
+        <w:t xml:space="preserve"> </w:t>
+      </w:r>
+      <w:r>
+        <w:t xml:space="preserve">10.</w:t>
+      </w:r>
+      <w:r>
+        <w:t xml:space="preserve"> </w:t>
+      </w:r>
+      <w:r>
+        <w:rPr>
+          <w:bCs/>
+          <w:b/>
+        </w:rPr>
+        <w:t xml:space="preserve">Boxes</w:t>
+      </w:r>
+      <w:r>
+        <w:t xml:space="preserve"> </w:t>
+      </w:r>
+      <w:r>
+        <w:t xml:space="preserve">7.</w:t>
+      </w:r>
+      <w:r>
+        <w:t xml:space="preserve"> </w:t>
+      </w:r>
+      <w:r>
+        <w:rPr>
+          <w:bCs/>
+          <w:b/>
+        </w:rPr>
+        <w:t xml:space="preserve">Defense</w:t>
+      </w:r>
+      <w:r>
+        <w:t xml:space="preserve"> </w:t>
+      </w:r>
+      <w:r>
+        <w:t xml:space="preserve">V (Toughness).</w:t>
+      </w:r>
+      <w:r>
+        <w:t xml:space="preserve"> </w:t>
+      </w:r>
+      <w:r>
+        <w:rPr>
+          <w:bCs/>
+          <w:b/>
+        </w:rPr>
+        <w:t xml:space="preserve">Powers</w:t>
+      </w:r>
+      <w:r>
+        <w:t xml:space="preserve"> </w:t>
+      </w:r>
+      <w:r>
+        <w:t xml:space="preserve">Strength V, Toughness V, Regeneration III.</w:t>
+      </w:r>
+      <w:r>
+        <w:t xml:space="preserve"> </w:t>
+      </w:r>
+      <w:r>
+        <w:rPr>
+          <w:bCs/>
+          <w:b/>
+        </w:rPr>
+        <w:t xml:space="preserve">Skills</w:t>
+      </w:r>
+      <w:r>
+        <w:t xml:space="preserve"> </w:t>
+      </w:r>
+      <w:r>
+        <w:t xml:space="preserve">Brawling 17, Athletics 15, Investigation 13 (recoveries), Streetwise 13.</w:t>
+      </w:r>
+      <w:r>
+        <w:t xml:space="preserve"> </w:t>
+      </w:r>
+      <w:r>
+        <w:rPr>
+          <w:bCs/>
+          <w:b/>
+        </w:rPr>
+        <w:t xml:space="preserve">It never sticks.</w:t>
+      </w:r>
+      <w:r>
+        <w:t xml:space="preserve"> </w:t>
+      </w:r>
+      <w:r>
+        <w:t xml:space="preserve">Reported dead several times. He’s come for someone, never for a fight: hand over the escapee and he leaves.</w:t>
+      </w:r>
+    </w:p>
+    <w:p>
+      <w:pPr>
+        <w:pStyle w:val="BodyText"/>
+      </w:pPr>
+      <w:r>
+        <w:rPr>
+          <w:bCs/>
+          <w:b/>
+        </w:rPr>
+        <w:t xml:space="preserve">Uathach (Ciara Byrne).</w:t>
+      </w:r>
+      <w:r>
+        <w:t xml:space="preserve"> </w:t>
+      </w:r>
+      <w:r>
+        <w:t xml:space="preserve">When Ciara Byrne recites a litany she found on her grandfather’s farm, she takes on the body and power of</w:t>
+      </w:r>
+      <w:r>
+        <w:t xml:space="preserve"> </w:t>
+      </w:r>
+      <w:r>
+        <w:rPr>
+          <w:bCs/>
+          <w:b/>
+        </w:rPr>
+        <w:t xml:space="preserve">Uathach</w:t>
+      </w:r>
+      <w:r>
+        <w:t xml:space="preserve">, a Celtic warrior goddess pushed to the edges of Irish myth, and shares her consciousness with the bloodthirsty spirit. Uathach usually avenges wrongs done to women around the world, but she has fought beside others against Autuarch in South America, against the Umkas, and against the minions of Shadow Earth.</w:t>
+      </w:r>
+    </w:p>
+    <w:p>
+      <w:pPr>
+        <w:pStyle w:val="BlockText"/>
+      </w:pPr>
+      <w:r>
+        <w:t xml:space="preserve">Come, Uathach,</w:t>
+      </w:r>
+      <w:r>
+        <w:t xml:space="preserve"> </w:t>
+      </w:r>
+      <w:r>
+        <w:t xml:space="preserve">walk with me in the clash,</w:t>
+      </w:r>
+      <w:r>
+        <w:t xml:space="preserve"> </w:t>
+      </w:r>
+      <w:r>
+        <w:t xml:space="preserve">stand with me in the storm,</w:t>
+      </w:r>
+      <w:r>
+        <w:t xml:space="preserve"> </w:t>
+      </w:r>
+      <w:r>
+        <w:t xml:space="preserve">lend me your hand of red flame,</w:t>
+      </w:r>
+      <w:r>
+        <w:t xml:space="preserve"> </w:t>
+      </w:r>
+      <w:r>
+        <w:t xml:space="preserve">your unbroken will of iron.</w:t>
+      </w:r>
+      <w:r>
+        <w:t xml:space="preserve"> </w:t>
+      </w:r>
+      <w:r>
+        <w:t xml:space="preserve">I kindle your name,</w:t>
+      </w:r>
+      <w:r>
+        <w:t xml:space="preserve"> </w:t>
+      </w:r>
+      <w:r>
+        <w:t xml:space="preserve">I breathe your power,</w:t>
+      </w:r>
+      <w:r>
+        <w:t xml:space="preserve"> </w:t>
+      </w:r>
+      <w:r>
+        <w:t xml:space="preserve">I bear your shadow,</w:t>
+      </w:r>
+      <w:r>
+        <w:t xml:space="preserve"> </w:t>
+      </w:r>
+      <w:r>
+        <w:t xml:space="preserve">and I rise.</w:t>
+      </w:r>
+    </w:p>
+    <w:p>
+      <w:pPr>
         <w:pStyle w:val="FirstParagraph"/>
       </w:pPr>
       <w:r>
         <w:rPr>
+          <w:iCs/>
+          <w:i/>
+        </w:rPr>
+        <w:t xml:space="preserve">Class IV.</w:t>
+      </w:r>
+      <w:r>
+        <w:t xml:space="preserve"> </w:t>
+      </w:r>
+      <w:r>
+        <w:rPr>
+          <w:bCs/>
+          <w:b/>
+        </w:rPr>
+        <w:t xml:space="preserve">Attacks</w:t>
+      </w:r>
+      <w:r>
+        <w:t xml:space="preserve"> </w:t>
+      </w:r>
+      <w:r>
+        <w:t xml:space="preserve">Melee 16 (the goddess’s spear, Class IV); Powers 14 (hand of red flame, Blast III).</w:t>
+      </w:r>
+      <w:r>
+        <w:t xml:space="preserve"> </w:t>
+      </w:r>
+      <w:r>
+        <w:rPr>
+          <w:bCs/>
+          <w:b/>
+        </w:rPr>
+        <w:t xml:space="preserve">Dodge</w:t>
+      </w:r>
+      <w:r>
+        <w:t xml:space="preserve"> </w:t>
+      </w:r>
+      <w:r>
+        <w:t xml:space="preserve">12.</w:t>
+      </w:r>
+      <w:r>
+        <w:t xml:space="preserve"> </w:t>
+      </w:r>
+      <w:r>
+        <w:rPr>
+          <w:bCs/>
+          <w:b/>
+        </w:rPr>
+        <w:t xml:space="preserve">Boxes</w:t>
+      </w:r>
+      <w:r>
+        <w:t xml:space="preserve"> </w:t>
+      </w:r>
+      <w:r>
+        <w:t xml:space="preserve">5.</w:t>
+      </w:r>
+      <w:r>
+        <w:t xml:space="preserve"> </w:t>
+      </w:r>
+      <w:r>
+        <w:rPr>
+          <w:bCs/>
+          <w:b/>
+        </w:rPr>
+        <w:t xml:space="preserve">Defense</w:t>
+      </w:r>
+      <w:r>
+        <w:t xml:space="preserve"> </w:t>
+      </w:r>
+      <w:r>
+        <w:t xml:space="preserve">III (the goddess’s body).</w:t>
+      </w:r>
+      <w:r>
+        <w:t xml:space="preserve"> </w:t>
+      </w:r>
+      <w:r>
+        <w:rPr>
+          <w:bCs/>
+          <w:b/>
+        </w:rPr>
+        <w:t xml:space="preserve">Powers</w:t>
+      </w:r>
+      <w:r>
+        <w:t xml:space="preserve"> </w:t>
+      </w:r>
+      <w:r>
+        <w:t xml:space="preserve">Transformation (the litany, one action): Strength IV, Toughness III, Blast III (red flame), Super Leaping II.</w:t>
+      </w:r>
+      <w:r>
+        <w:t xml:space="preserve"> </w:t>
+      </w:r>
+      <w:r>
+        <w:rPr>
+          <w:bCs/>
+          <w:b/>
+        </w:rPr>
+        <w:t xml:space="preserve">Skills</w:t>
+      </w:r>
+      <w:r>
+        <w:t xml:space="preserve"> </w:t>
+      </w:r>
+      <w:r>
+        <w:t xml:space="preserve">Melee 16, Athletics 15, Read People 12, Persuasion 13 (as Ciara).</w:t>
+      </w:r>
+      <w:r>
+        <w:t xml:space="preserve"> </w:t>
+      </w:r>
+      <w:r>
+        <w:rPr>
+          <w:bCs/>
+          <w:b/>
+        </w:rPr>
+        <w:t xml:space="preserve">Shared mind.</w:t>
+      </w:r>
+      <w:r>
+        <w:t xml:space="preserve"> </w:t>
+      </w:r>
+      <w:r>
+        <w:t xml:space="preserve">The goddess is bloodthirsty: sparing a beaten enemy takes a Will roll. Ciara can’t change back until the fight ends.</w:t>
+      </w:r>
+    </w:p>
+    <w:p>
+      <w:pPr>
+        <w:pStyle w:val="BodyText"/>
+      </w:pPr>
+      <w:r>
+        <w:rPr>
           <w:bCs/>
           <w:b/>
         </w:rPr>
@@ -2942,6 +5422,285 @@
       </w:r>
       <w:r>
         <w:t xml:space="preserve">Once an adjunct professor of comparative folklore in New York, obsessed with a single current of power he believed older than civilization. In a university archive he found untranslated manuscripts in a 19th-century occultist’s papers: a ritual encoded in language itself. He spoke the words aloud, and his mind opened for a few burning moments to the raw currents of Otherworld. It shattered him. He lost his job and his name, and wanders New York’s alleys and subway tunnels muttering. Yet his chalk sigils ward whole stations by accident, his ramblings predict murders and market crashes, pigeons land on his shoulders as if awaiting orders, and children sometimes see a crown of burning letters over his head. He is part prophet, part lunatic, part guardian and part danger.</w:t>
+      </w:r>
+    </w:p>
+    <w:p>
+      <w:pPr>
+        <w:pStyle w:val="BodyText"/>
+      </w:pPr>
+      <w:r>
+        <w:rPr>
+          <w:iCs/>
+          <w:i/>
+        </w:rPr>
+        <w:t xml:space="preserve">Class IV.</w:t>
+      </w:r>
+      <w:r>
+        <w:t xml:space="preserve"> </w:t>
+      </w:r>
+      <w:r>
+        <w:rPr>
+          <w:bCs/>
+          <w:b/>
+        </w:rPr>
+        <w:t xml:space="preserve">Attacks</w:t>
+      </w:r>
+      <w:r>
+        <w:t xml:space="preserve"> </w:t>
+      </w:r>
+      <w:r>
+        <w:t xml:space="preserve">Powers 14 (a crown of burning letters, Class III).</w:t>
+      </w:r>
+      <w:r>
+        <w:t xml:space="preserve"> </w:t>
+      </w:r>
+      <w:r>
+        <w:rPr>
+          <w:bCs/>
+          <w:b/>
+        </w:rPr>
+        <w:t xml:space="preserve">Dodge</w:t>
+      </w:r>
+      <w:r>
+        <w:t xml:space="preserve"> </w:t>
+      </w:r>
+      <w:r>
+        <w:t xml:space="preserve">9.</w:t>
+      </w:r>
+      <w:r>
+        <w:t xml:space="preserve"> </w:t>
+      </w:r>
+      <w:r>
+        <w:rPr>
+          <w:bCs/>
+          <w:b/>
+        </w:rPr>
+        <w:t xml:space="preserve">Boxes</w:t>
+      </w:r>
+      <w:r>
+        <w:t xml:space="preserve"> </w:t>
+      </w:r>
+      <w:r>
+        <w:t xml:space="preserve">3.</w:t>
+      </w:r>
+      <w:r>
+        <w:t xml:space="preserve"> </w:t>
+      </w:r>
+      <w:r>
+        <w:rPr>
+          <w:bCs/>
+          <w:b/>
+        </w:rPr>
+        <w:t xml:space="preserve">Defense</w:t>
+      </w:r>
+      <w:r>
+        <w:t xml:space="preserve"> </w:t>
+      </w:r>
+      <w:r>
+        <w:t xml:space="preserve">none.</w:t>
+      </w:r>
+      <w:r>
+        <w:t xml:space="preserve"> </w:t>
+      </w:r>
+      <w:r>
+        <w:rPr>
+          <w:bCs/>
+          <w:b/>
+        </w:rPr>
+        <w:t xml:space="preserve">Powers</w:t>
+      </w:r>
+      <w:r>
+        <w:t xml:space="preserve"> </w:t>
+      </w:r>
+      <w:r>
+        <w:t xml:space="preserve">Warding IV (chalk sigils, by accident), Precognition III, Mystic Sight IV, Animal Control II (pigeons).</w:t>
+      </w:r>
+      <w:r>
+        <w:t xml:space="preserve"> </w:t>
+      </w:r>
+      <w:r>
+        <w:rPr>
+          <w:bCs/>
+          <w:b/>
+        </w:rPr>
+        <w:t xml:space="preserve">Skills</w:t>
+      </w:r>
+      <w:r>
+        <w:t xml:space="preserve"> </w:t>
+      </w:r>
+      <w:r>
+        <w:t xml:space="preserve">Occult 17, Streetwise 14, Read People 12, Persuasion 8.</w:t>
+      </w:r>
+      <w:r>
+        <w:t xml:space="preserve"> </w:t>
+      </w:r>
+      <w:r>
+        <w:rPr>
+          <w:bCs/>
+          <w:b/>
+        </w:rPr>
+        <w:t xml:space="preserve">Part prophet, part danger.</w:t>
+      </w:r>
+      <w:r>
+        <w:t xml:space="preserve"> </w:t>
+      </w:r>
+      <w:r>
+        <w:t xml:space="preserve">His ramblings hold a real clue each scene (a Read People or Occult roll to make sense of it). Threaten him and every pigeon in the tunnel answers.</w:t>
+      </w:r>
+    </w:p>
+    <w:p>
+      <w:pPr>
+        <w:pStyle w:val="BodyText"/>
+      </w:pPr>
+      <w:r>
+        <w:rPr>
+          <w:bCs/>
+          <w:b/>
+        </w:rPr>
+        <w:t xml:space="preserve">Autuarch.</w:t>
+      </w:r>
+      <w:r>
+        <w:t xml:space="preserve"> </w:t>
+      </w:r>
+      <w:r>
+        <w:t xml:space="preserve">Master of the</w:t>
+      </w:r>
+      <w:r>
+        <w:t xml:space="preserve"> </w:t>
+      </w:r>
+      <w:r>
+        <w:rPr>
+          <w:bCs/>
+          <w:b/>
+        </w:rPr>
+        <w:t xml:space="preserve">White Hand</w:t>
+      </w:r>
+      <w:r>
+        <w:t xml:space="preserve">. He led the cell of terrorist Operants that attacked the US Capitol in 1982, escaped to Argentina and founded the White Hand there; his cell brought down the Sears Tower in 2001, and in 2012 he and Steel Hawk opened the breach over New York. The EMD rates him Class VI, a threat to nations. No one outside the White Hand knows his face or his name.</w:t>
+      </w:r>
+    </w:p>
+    <w:p>
+      <w:pPr>
+        <w:pStyle w:val="BodyText"/>
+      </w:pPr>
+      <w:r>
+        <w:rPr>
+          <w:iCs/>
+          <w:i/>
+        </w:rPr>
+        <w:t xml:space="preserve">Class VI.</w:t>
+      </w:r>
+      <w:r>
+        <w:t xml:space="preserve"> </w:t>
+      </w:r>
+      <w:r>
+        <w:rPr>
+          <w:bCs/>
+          <w:b/>
+        </w:rPr>
+        <w:t xml:space="preserve">Attacks</w:t>
+      </w:r>
+      <w:r>
+        <w:t xml:space="preserve"> </w:t>
+      </w:r>
+      <w:r>
+        <w:t xml:space="preserve">Powers 17 (will made force, Class VI).</w:t>
+      </w:r>
+      <w:r>
+        <w:t xml:space="preserve"> </w:t>
+      </w:r>
+      <w:r>
+        <w:rPr>
+          <w:bCs/>
+          <w:b/>
+        </w:rPr>
+        <w:t xml:space="preserve">Dodge</w:t>
+      </w:r>
+      <w:r>
+        <w:t xml:space="preserve"> </w:t>
+      </w:r>
+      <w:r>
+        <w:t xml:space="preserve">12 (a second defense each round).</w:t>
+      </w:r>
+      <w:r>
+        <w:t xml:space="preserve"> </w:t>
+      </w:r>
+      <w:r>
+        <w:rPr>
+          <w:bCs/>
+          <w:b/>
+        </w:rPr>
+        <w:t xml:space="preserve">Boxes</w:t>
+      </w:r>
+      <w:r>
+        <w:t xml:space="preserve"> </w:t>
+      </w:r>
+      <w:r>
+        <w:t xml:space="preserve">8.</w:t>
+      </w:r>
+      <w:r>
+        <w:t xml:space="preserve"> </w:t>
+      </w:r>
+      <w:r>
+        <w:rPr>
+          <w:bCs/>
+          <w:b/>
+        </w:rPr>
+        <w:t xml:space="preserve">Defense</w:t>
+      </w:r>
+      <w:r>
+        <w:t xml:space="preserve"> </w:t>
+      </w:r>
+      <w:r>
+        <w:t xml:space="preserve">V (Force Field).</w:t>
+      </w:r>
+      <w:r>
+        <w:t xml:space="preserve"> </w:t>
+      </w:r>
+      <w:r>
+        <w:rPr>
+          <w:bCs/>
+          <w:b/>
+        </w:rPr>
+        <w:t xml:space="preserve">Powers</w:t>
+      </w:r>
+      <w:r>
+        <w:t xml:space="preserve"> </w:t>
+      </w:r>
+      <w:r>
+        <w:t xml:space="preserve">Telekinesis VI, Force Field V, Portals V (the 2012 breach), Flight IV, Mind Control III (his fanatics).</w:t>
+      </w:r>
+      <w:r>
+        <w:t xml:space="preserve"> </w:t>
+      </w:r>
+      <w:r>
+        <w:rPr>
+          <w:bCs/>
+          <w:b/>
+        </w:rPr>
+        <w:t xml:space="preserve">Skills</w:t>
+      </w:r>
+      <w:r>
+        <w:t xml:space="preserve"> </w:t>
+      </w:r>
+      <w:r>
+        <w:t xml:space="preserve">Leadership 17, Deception 15, Occult 14, Persuasion 15.</w:t>
+      </w:r>
+      <w:r>
+        <w:t xml:space="preserve"> </w:t>
+      </w:r>
+      <w:r>
+        <w:rPr>
+          <w:bCs/>
+          <w:b/>
+        </w:rPr>
+        <w:t xml:space="preserve">Master of the White Hand.</w:t>
+      </w:r>
+      <w:r>
+        <w:t xml:space="preserve"> </w:t>
+      </w:r>
+      <w:r>
+        <w:t xml:space="preserve">Never met alone: White Hand soldiers die for him without a word. He has escaped ExLAW three times; he always has a door open behind him.</w:t>
       </w:r>
     </w:p>
     <w:bookmarkEnd w:id="22"/>

</xml_diff>